<commit_message>
Update after first publication of PCCP Article
</commit_message>
<xml_diff>
--- a/AWATAR_QuickStartGuide.docx
+++ b/AWATAR_QuickStartGuide.docx
@@ -1,11 +1,13 @@
 
 <file path=word/document.xml><?xml version="1.0" encoding="utf-8"?>
-<w:document xmlns:wpc="http://schemas.microsoft.com/office/word/2010/wordprocessingCanvas" xmlns:cx="http://schemas.microsoft.com/office/drawing/2014/chartex" xmlns:cx1="http://schemas.microsoft.com/office/drawing/2015/9/8/chartex" xmlns:cx2="http://schemas.microsoft.com/office/drawing/2015/10/21/chartex" xmlns:cx3="http://schemas.microsoft.com/office/drawing/2016/5/9/chartex" xmlns:cx4="http://schemas.microsoft.com/office/drawing/2016/5/10/chartex" xmlns:cx5="http://schemas.microsoft.com/office/drawing/2016/5/11/chartex" xmlns:cx6="http://schemas.microsoft.com/office/drawing/2016/5/12/chartex" xmlns:cx7="http://schemas.microsoft.com/office/drawing/2016/5/13/chartex" xmlns:cx8="http://schemas.microsoft.com/office/drawing/2016/5/14/chartex" xmlns:mc="http://schemas.openxmlformats.org/markup-compatibility/2006" xmlns:aink="http://schemas.microsoft.com/office/drawing/2016/ink" xmlns:am3d="http://schemas.microsoft.com/office/drawing/2017/model3d" xmlns:o="urn:schemas-microsoft-com:office:office" xmlns:oel="http://schemas.microsoft.com/office/2019/extlst" xmlns:r="http://schemas.openxmlformats.org/officeDocument/2006/relationships" xmlns:m="http://schemas.openxmlformats.org/officeDocument/2006/math" xmlns:v="urn:schemas-microsoft-com:vml" xmlns:wp14="http://schemas.microsoft.com/office/word/2010/wordprocessingDrawing" xmlns:wp="http://schemas.openxmlformats.org/drawingml/2006/wordprocessingDrawing" xmlns:w10="urn:schemas-microsoft-com:office:word" xmlns:w="http://schemas.openxmlformats.org/wordprocessingml/2006/main" xmlns:w14="http://schemas.microsoft.com/office/word/2010/wordml" xmlns:w15="http://schemas.microsoft.com/office/word/2012/wordml" xmlns:w16cex="http://schemas.microsoft.com/office/word/2018/wordml/cex" xmlns:w16cid="http://schemas.microsoft.com/office/word/2016/wordml/cid" xmlns:w16="http://schemas.microsoft.com/office/word/2018/wordml" xmlns:w16du="http://schemas.microsoft.com/office/word/2023/wordml/word16du" xmlns:w16sdtdh="http://schemas.microsoft.com/office/word/2020/wordml/sdtdatahash" xmlns:w16sdtfl="http://schemas.microsoft.com/office/word/2024/wordml/sdtformatlock" xmlns:w16se="http://schemas.microsoft.com/office/word/2015/wordml/symex" xmlns:wpg="http://schemas.microsoft.com/office/word/2010/wordprocessingGroup" xmlns:wpi="http://schemas.microsoft.com/office/word/2010/wordprocessingInk" xmlns:wne="http://schemas.microsoft.com/office/word/2006/wordml" xmlns:wps="http://schemas.microsoft.com/office/word/2010/wordprocessingShape" mc:Ignorable="w14 w15 w16se w16cid w16 w16cex w16sdtdh w16sdtfl w16du wp14">
+<w:document xmlns:wpc="http://schemas.microsoft.com/office/word/2010/wordprocessingCanvas" xmlns:cx="http://schemas.microsoft.com/office/drawing/2014/chartex" xmlns:cx1="http://schemas.microsoft.com/office/drawing/2015/9/8/chartex" xmlns:cx2="http://schemas.microsoft.com/office/drawing/2015/10/21/chartex" xmlns:cx3="http://schemas.microsoft.com/office/drawing/2016/5/9/chartex" xmlns:cx4="http://schemas.microsoft.com/office/drawing/2016/5/10/chartex" xmlns:cx5="http://schemas.microsoft.com/office/drawing/2016/5/11/chartex" xmlns:cx6="http://schemas.microsoft.com/office/drawing/2016/5/12/chartex" xmlns:cx7="http://schemas.microsoft.com/office/drawing/2016/5/13/chartex" xmlns:cx8="http://schemas.microsoft.com/office/drawing/2016/5/14/chartex" xmlns:mc="http://schemas.openxmlformats.org/markup-compatibility/2006" xmlns:aink="http://schemas.microsoft.com/office/drawing/2016/ink" xmlns:am3d="http://schemas.microsoft.com/office/drawing/2017/model3d" xmlns:o="urn:schemas-microsoft-com:office:office" xmlns:r="http://schemas.openxmlformats.org/officeDocument/2006/relationships" xmlns:m="http://schemas.openxmlformats.org/officeDocument/2006/math" xmlns:v="urn:schemas-microsoft-com:vml" xmlns:wp14="http://schemas.microsoft.com/office/word/2010/wordprocessingDrawing" xmlns:wp="http://schemas.openxmlformats.org/drawingml/2006/wordprocessingDrawing" xmlns:w10="urn:schemas-microsoft-com:office:word" xmlns:w="http://schemas.openxmlformats.org/wordprocessingml/2006/main" xmlns:w14="http://schemas.microsoft.com/office/word/2010/wordml" xmlns:w15="http://schemas.microsoft.com/office/word/2012/wordml" xmlns:w16cid="http://schemas.microsoft.com/office/word/2016/wordml/cid" xmlns:w16se="http://schemas.microsoft.com/office/word/2015/wordml/symex" xmlns:wpg="http://schemas.microsoft.com/office/word/2010/wordprocessingGroup" xmlns:wpi="http://schemas.microsoft.com/office/word/2010/wordprocessingInk" xmlns:wne="http://schemas.microsoft.com/office/word/2006/wordml" xmlns:wps="http://schemas.microsoft.com/office/word/2010/wordprocessingShape" mc:Ignorable="w14 w15 w16se w16cid wp14">
   <w:body>
     <w:p>
       <w:pPr>
         <w:pStyle w:val="Titel"/>
       </w:pPr>
+      <w:bookmarkStart w:id="0" w:name="_GoBack"/>
+      <w:bookmarkEnd w:id="0"/>
       <w:r>
         <w:t xml:space="preserve">Quick start guide for </w:t>
       </w:r>
@@ -190,6 +192,44 @@
       </w:r>
       <w:r>
         <w:t>, see the User Manual.</w:t>
+      </w:r>
+      <w:r>
+        <w:t xml:space="preserve"> The scientific background and applications are described in </w:t>
+      </w:r>
+      <w:r>
+        <w:rPr>
+          <w:i/>
+        </w:rPr>
+        <w:t>Phys. Chem. Chem. Phys.</w:t>
+      </w:r>
+      <w:r>
+        <w:t xml:space="preserve"> </w:t>
+      </w:r>
+      <w:r>
+        <w:rPr>
+          <w:i/>
+        </w:rPr>
+        <w:t>in print</w:t>
+      </w:r>
+      <w:r>
+        <w:t>,</w:t>
+      </w:r>
+      <w:r>
+        <w:t xml:space="preserve"> </w:t>
+      </w:r>
+      <w:hyperlink r:id="rId8" w:history="1">
+        <w:r>
+          <w:t xml:space="preserve">DOI: </w:t>
+        </w:r>
+        <w:r>
+          <w:rPr>
+            <w:rStyle w:val="Hyperlink"/>
+          </w:rPr>
+          <w:t>10.1039/D6CP00705H</w:t>
+        </w:r>
+      </w:hyperlink>
+      <w:r>
+        <w:t>.</w:t>
       </w:r>
     </w:p>
     <w:p>
@@ -302,6 +342,9 @@
     </w:p>
     <w:p>
       <w:r>
+        <w:rPr>
+          <w:noProof/>
+        </w:rPr>
         <w:drawing>
           <wp:inline distT="0" distB="0" distL="0" distR="0" wp14:anchorId="650A3E2F" wp14:editId="137A45D2">
             <wp:extent cx="5760720" cy="3608070"/>
@@ -318,7 +361,7 @@
                     <pic:cNvPicPr/>
                   </pic:nvPicPr>
                   <pic:blipFill>
-                    <a:blip r:embed="rId8"/>
+                    <a:blip r:embed="rId9"/>
                     <a:stretch>
                       <a:fillRect/>
                     </a:stretch>
@@ -415,6 +458,7 @@
             <w:docPart w:val="DefaultPlaceholder_-1854013440"/>
           </w:placeholder>
         </w:sdtPr>
+        <w:sdtEndPr/>
         <w:sdtContent>
           <w:r>
             <w:fldChar w:fldCharType="begin"/>
@@ -475,6 +519,9 @@
     </w:p>
     <w:p>
       <w:r>
+        <w:rPr>
+          <w:noProof/>
+        </w:rPr>
         <w:lastRenderedPageBreak/>
         <w:drawing>
           <wp:inline distT="0" distB="0" distL="0" distR="0" wp14:anchorId="0BB244FC" wp14:editId="1463F6F1">
@@ -492,7 +539,7 @@
                     <pic:cNvPicPr/>
                   </pic:nvPicPr>
                   <pic:blipFill>
-                    <a:blip r:embed="rId9"/>
+                    <a:blip r:embed="rId10"/>
                     <a:stretch>
                       <a:fillRect/>
                     </a:stretch>
@@ -621,6 +668,9 @@
         <w:ind w:left="360"/>
       </w:pPr>
       <w:r>
+        <w:rPr>
+          <w:noProof/>
+        </w:rPr>
         <w:drawing>
           <wp:inline distT="0" distB="0" distL="0" distR="0" wp14:anchorId="407549BF" wp14:editId="08BC0127">
             <wp:extent cx="5760720" cy="3178810"/>
@@ -634,223 +684,6 @@
                 <pic:pic xmlns:pic="http://schemas.openxmlformats.org/drawingml/2006/picture">
                   <pic:nvPicPr>
                     <pic:cNvPr id="981352907" name=""/>
-                    <pic:cNvPicPr/>
-                  </pic:nvPicPr>
-                  <pic:blipFill>
-                    <a:blip r:embed="rId10"/>
-                    <a:stretch>
-                      <a:fillRect/>
-                    </a:stretch>
-                  </pic:blipFill>
-                  <pic:spPr>
-                    <a:xfrm>
-                      <a:off x="0" y="0"/>
-                      <a:ext cx="5760720" cy="3178810"/>
-                    </a:xfrm>
-                    <a:prstGeom prst="rect">
-                      <a:avLst/>
-                    </a:prstGeom>
-                  </pic:spPr>
-                </pic:pic>
-              </a:graphicData>
-            </a:graphic>
-          </wp:inline>
-        </w:drawing>
-      </w:r>
-    </w:p>
-    <w:p>
-      <w:pPr>
-        <w:ind w:left="851"/>
-      </w:pPr>
-      <w:r>
-        <w:t>This panel contains all information about the well needed for the calculations, namely the</w:t>
-      </w:r>
-      <w:r>
-        <w:t xml:space="preserve"> </w:t>
-      </w:r>
-      <w:r>
-        <w:t>vibrational frequencies and infrared intensities, the rotational constants along with the rotational symmetry number,</w:t>
-      </w:r>
-      <w:r>
-        <w:t xml:space="preserve"> and</w:t>
-      </w:r>
-      <w:r>
-        <w:t xml:space="preserve"> the energy and degeneracy of the well. </w:t>
-      </w:r>
-    </w:p>
-    <w:p>
-      <w:pPr>
-        <w:ind w:left="851"/>
-      </w:pPr>
-      <w:r>
-        <w:t xml:space="preserve">For documentation purposes, the numbers as calculated appear on the left of the “vib” keyword. The frequencies modified by the scaling factor are shown on the right. </w:t>
-      </w:r>
-      <w:r>
-        <w:t xml:space="preserve">One can further modify these values if needed. </w:t>
-      </w:r>
-      <w:r>
-        <w:t xml:space="preserve">It is strongly recommended to leave the </w:t>
-      </w:r>
-      <w:r>
-        <w:t xml:space="preserve">calculated </w:t>
-      </w:r>
-      <w:r>
-        <w:t xml:space="preserve">value as is and only modify the values on the right. This way, one can keep track of </w:t>
-      </w:r>
-      <w:r>
-        <w:t xml:space="preserve">all changes. Note that AWATAR uses the </w:t>
-      </w:r>
-      <w:r>
-        <w:t xml:space="preserve">modified values </w:t>
-      </w:r>
-      <w:r>
-        <w:t>on the right</w:t>
-      </w:r>
-      <w:r>
-        <w:t>, if present</w:t>
-      </w:r>
-      <w:r>
-        <w:t>.</w:t>
-      </w:r>
-    </w:p>
-    <w:p>
-      <w:pPr>
-        <w:pStyle w:val="Listenabsatz"/>
-        <w:numPr>
-          <w:ilvl w:val="0"/>
-          <w:numId w:val="11"/>
-        </w:numPr>
-      </w:pPr>
-      <w:r>
-        <w:t xml:space="preserve">Now the </w:t>
-      </w:r>
-      <w:r>
-        <w:t>density</w:t>
-      </w:r>
-      <w:r>
-        <w:t xml:space="preserve"> of states can be calculated, using the button “</w:t>
-      </w:r>
-      <w:r>
-        <w:rPr>
-          <w:b/>
-          <w:bCs/>
-        </w:rPr>
-        <w:t>Calculate DoS</w:t>
-      </w:r>
-      <w:r>
-        <w:t xml:space="preserve">”. </w:t>
-      </w:r>
-      <w:r>
-        <w:t xml:space="preserve">AWATAR reads all </w:t>
-      </w:r>
-      <w:r>
-        <w:t xml:space="preserve">required </w:t>
-      </w:r>
-      <w:r>
-        <w:t>information from the panels “Parameters” and “Well 0” and calculates the density of states as described in Ref</w:t>
-      </w:r>
-      <w:r>
-        <w:t xml:space="preserve"> </w:t>
-      </w:r>
-      <w:sdt>
-        <w:sdtPr>
-          <w:alias w:val="To edit, see citavi.com/edit"/>
-          <w:tag w:val="CitaviPlaceholder#28a2490d-22d5-4b31-8f94-e84ab382fe05"/>
-          <w:id w:val="-784571315"/>
-          <w:placeholder>
-            <w:docPart w:val="DefaultPlaceholder_-1854013440"/>
-          </w:placeholder>
-        </w:sdtPr>
-        <w:sdtContent>
-          <w:r>
-            <w:fldChar w:fldCharType="begin"/>
-          </w:r>
-          <w:r>
-            <w:instrText>ADDIN CitaviPlaceholder{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}</w:instrText>
-          </w:r>
-          <w:r>
-            <w:fldChar w:fldCharType="separate"/>
-          </w:r>
-          <w:r>
-            <w:t>2</w:t>
-          </w:r>
-          <w:r>
-            <w:fldChar w:fldCharType="end"/>
-          </w:r>
-        </w:sdtContent>
-      </w:sdt>
-      <w:r>
-        <w:t>.</w:t>
-      </w:r>
-      <w:r>
-        <w:t xml:space="preserve"> </w:t>
-      </w:r>
-      <w:r>
-        <w:t>T</w:t>
-      </w:r>
-      <w:r>
-        <w:t xml:space="preserve">he density of states of the </w:t>
-      </w:r>
-      <w:r>
-        <w:t>w</w:t>
-      </w:r>
-      <w:r>
-        <w:t>ell as a function of the total energy</w:t>
-      </w:r>
-      <w:r>
-        <w:t xml:space="preserve"> appears in the panel “</w:t>
-      </w:r>
-      <w:r>
-        <w:rPr>
-          <w:b/>
-          <w:bCs/>
-        </w:rPr>
-        <w:t>Results</w:t>
-      </w:r>
-      <w:r>
-        <w:t>”</w:t>
-      </w:r>
-      <w:r>
-        <w:t>.</w:t>
-      </w:r>
-      <w:r>
-        <w:t xml:space="preserve"> The results panel works like an editor</w:t>
-      </w:r>
-      <w:r>
-        <w:t>.</w:t>
-      </w:r>
-      <w:r>
-        <w:t xml:space="preserve"> Results can be copied for further use, e.g. graphical display, </w:t>
-      </w:r>
-      <w:r>
-        <w:t>by</w:t>
-      </w:r>
-      <w:r>
-        <w:t xml:space="preserve"> </w:t>
-      </w:r>
-      <w:r>
-        <w:t>other programs</w:t>
-      </w:r>
-      <w:r>
-        <w:t>.</w:t>
-      </w:r>
-    </w:p>
-    <w:p>
-      <w:r>
-        <w:lastRenderedPageBreak/>
-        <w:drawing>
-          <wp:inline distT="0" distB="0" distL="0" distR="0" wp14:anchorId="68C4202C" wp14:editId="6669F6CA">
-            <wp:extent cx="5760720" cy="3178810"/>
-            <wp:effectExtent l="0" t="0" r="0" b="2540"/>
-            <wp:docPr id="1965369061" name="Grafik 1"/>
-            <wp:cNvGraphicFramePr>
-              <a:graphicFrameLocks xmlns:a="http://schemas.openxmlformats.org/drawingml/2006/main" noChangeAspect="1"/>
-            </wp:cNvGraphicFramePr>
-            <a:graphic xmlns:a="http://schemas.openxmlformats.org/drawingml/2006/main">
-              <a:graphicData uri="http://schemas.openxmlformats.org/drawingml/2006/picture">
-                <pic:pic xmlns:pic="http://schemas.openxmlformats.org/drawingml/2006/picture">
-                  <pic:nvPicPr>
-                    <pic:cNvPr id="1965369061" name=""/>
                     <pic:cNvPicPr/>
                   </pic:nvPicPr>
                   <pic:blipFill>
@@ -880,114 +713,190 @@
         <w:ind w:left="851"/>
       </w:pPr>
       <w:r>
-        <w:t xml:space="preserve">Next, we want to load a loose </w:t>
-      </w:r>
-      <w:r>
-        <w:t>t</w:t>
-      </w:r>
-      <w:r>
-        <w:t xml:space="preserve">ransition </w:t>
-      </w:r>
-      <w:r>
-        <w:t>s</w:t>
-      </w:r>
-      <w:r>
-        <w:t>tate. Use the button “</w:t>
+        <w:t>This panel contains all information about the well needed for the calculations, namely the</w:t>
+      </w:r>
+      <w:r>
+        <w:t xml:space="preserve"> </w:t>
+      </w:r>
+      <w:r>
+        <w:t>vibrational frequencies and infrared intensities, the rotational constants along with the rotational symmetry number,</w:t>
+      </w:r>
+      <w:r>
+        <w:t xml:space="preserve"> and</w:t>
+      </w:r>
+      <w:r>
+        <w:t xml:space="preserve"> the energy and degeneracy of the well. </w:t>
+      </w:r>
+    </w:p>
+    <w:p>
+      <w:pPr>
+        <w:ind w:left="851"/>
+      </w:pPr>
+      <w:r>
+        <w:t xml:space="preserve">For documentation purposes, the numbers as calculated appear on the left of the “vib” keyword. The frequencies modified by the scaling factor are shown on the right. </w:t>
+      </w:r>
+      <w:r>
+        <w:t xml:space="preserve">One can further modify these values if needed. </w:t>
+      </w:r>
+      <w:r>
+        <w:t xml:space="preserve">It is strongly recommended to leave the </w:t>
+      </w:r>
+      <w:r>
+        <w:t xml:space="preserve">calculated </w:t>
+      </w:r>
+      <w:r>
+        <w:t xml:space="preserve">value as is and only modify the values on the right. This way, one can keep track of </w:t>
+      </w:r>
+      <w:r>
+        <w:t xml:space="preserve">all changes. Note that AWATAR uses the </w:t>
+      </w:r>
+      <w:r>
+        <w:t xml:space="preserve">modified values </w:t>
+      </w:r>
+      <w:r>
+        <w:t>on the right</w:t>
+      </w:r>
+      <w:r>
+        <w:t>, if present</w:t>
+      </w:r>
+      <w:r>
+        <w:t>.</w:t>
+      </w:r>
+    </w:p>
+    <w:p>
+      <w:pPr>
+        <w:pStyle w:val="Listenabsatz"/>
+        <w:numPr>
+          <w:ilvl w:val="0"/>
+          <w:numId w:val="11"/>
+        </w:numPr>
+      </w:pPr>
+      <w:r>
+        <w:t xml:space="preserve">Now the </w:t>
+      </w:r>
+      <w:r>
+        <w:t>density</w:t>
+      </w:r>
+      <w:r>
+        <w:t xml:space="preserve"> of states can be calculated, using the button “</w:t>
       </w:r>
       <w:r>
         <w:rPr>
           <w:b/>
           <w:bCs/>
         </w:rPr>
-        <w:t>Load loose TS Fragment 1</w:t>
-      </w:r>
-      <w:r>
-        <w:t>” and choose the Gaussian log</w:t>
-      </w:r>
-      <w:r>
-        <w:t>-</w:t>
-      </w:r>
-      <w:r>
-        <w:t xml:space="preserve">file of the first </w:t>
-      </w:r>
-      <w:r>
-        <w:t>f</w:t>
-      </w:r>
-      <w:r>
-        <w:t>ragment, “</w:t>
+        <w:t>Calculate DoS</w:t>
+      </w:r>
+      <w:r>
+        <w:t xml:space="preserve">”. </w:t>
+      </w:r>
+      <w:r>
+        <w:t xml:space="preserve">AWATAR reads all </w:t>
+      </w:r>
+      <w:r>
+        <w:t xml:space="preserve">required </w:t>
+      </w:r>
+      <w:r>
+        <w:t>information from the panels “Parameters” and “Well 0” and calculates the density of states as described in Ref</w:t>
+      </w:r>
+      <w:r>
+        <w:t xml:space="preserve"> </w:t>
+      </w:r>
+      <w:sdt>
+        <w:sdtPr>
+          <w:alias w:val="To edit, see citavi.com/edit"/>
+          <w:tag w:val="CitaviPlaceholder#28a2490d-22d5-4b31-8f94-e84ab382fe05"/>
+          <w:id w:val="-784571315"/>
+          <w:placeholder>
+            <w:docPart w:val="DefaultPlaceholder_-1854013440"/>
+          </w:placeholder>
+        </w:sdtPr>
+        <w:sdtEndPr/>
+        <w:sdtContent>
+          <w:r>
+            <w:fldChar w:fldCharType="begin"/>
+          </w:r>
+          <w:r>
+            <w:instrText>ADDIN CitaviPlaceholder{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}</w:instrText>
+          </w:r>
+          <w:r>
+            <w:fldChar w:fldCharType="separate"/>
+          </w:r>
+          <w:r>
+            <w:t>2</w:t>
+          </w:r>
+          <w:r>
+            <w:fldChar w:fldCharType="end"/>
+          </w:r>
+        </w:sdtContent>
+      </w:sdt>
+      <w:r>
+        <w:t>.</w:t>
+      </w:r>
+      <w:r>
+        <w:t xml:space="preserve"> </w:t>
+      </w:r>
+      <w:r>
+        <w:t>T</w:t>
+      </w:r>
+      <w:r>
+        <w:t xml:space="preserve">he density of states of the </w:t>
+      </w:r>
+      <w:r>
+        <w:t>w</w:t>
+      </w:r>
+      <w:r>
+        <w:t>ell as a function of the total energy</w:t>
+      </w:r>
+      <w:r>
+        <w:t xml:space="preserve"> appears in the panel “</w:t>
       </w:r>
       <w:r>
         <w:rPr>
           <w:b/>
           <w:bCs/>
         </w:rPr>
-        <w:t>co3.com.log</w:t>
-      </w:r>
-      <w:r>
-        <w:t>”. A new panel called “TS</w:t>
-      </w:r>
-      <w:r>
-        <w:t> </w:t>
-      </w:r>
-      <w:r>
-        <w:t>0” appears</w:t>
-      </w:r>
-      <w:r>
-        <w:t>. Again, this panel</w:t>
-      </w:r>
-      <w:r>
-        <w:t xml:space="preserve"> contain</w:t>
-      </w:r>
-      <w:r>
-        <w:t>s</w:t>
-      </w:r>
-      <w:r>
-        <w:t xml:space="preserve"> all information</w:t>
-      </w:r>
-      <w:r>
-        <w:t xml:space="preserve"> about the first fragment which </w:t>
-      </w:r>
-      <w:r>
-        <w:t xml:space="preserve">AWATAR </w:t>
-      </w:r>
-      <w:r>
-        <w:t>will need</w:t>
-      </w:r>
-      <w:r>
-        <w:t xml:space="preserve"> for calculations</w:t>
-      </w:r>
-      <w:r>
-        <w:t>,</w:t>
+        <w:t>Results</w:t>
+      </w:r>
+      <w:r>
+        <w:t>”</w:t>
+      </w:r>
+      <w:r>
+        <w:t>.</w:t>
+      </w:r>
+      <w:r>
+        <w:t xml:space="preserve"> The results panel works like an editor</w:t>
+      </w:r>
+      <w:r>
+        <w:t>.</w:t>
+      </w:r>
+      <w:r>
+        <w:t xml:space="preserve"> Results can be copied for further use, e.g. graphical display, </w:t>
+      </w:r>
+      <w:r>
+        <w:t>by</w:t>
       </w:r>
       <w:r>
         <w:t xml:space="preserve"> </w:t>
       </w:r>
       <w:r>
-        <w:t>namely the vibrational frequencies</w:t>
-      </w:r>
-      <w:r>
-        <w:t>,</w:t>
-      </w:r>
-      <w:r>
-        <w:t xml:space="preserve"> the rotational constants</w:t>
-      </w:r>
-      <w:r>
-        <w:t>,</w:t>
-      </w:r>
-      <w:r>
-        <w:t xml:space="preserve"> the rotational symmetry number, and the energy and degeneracy</w:t>
-      </w:r>
-      <w:r>
-        <w:t>:</w:t>
+        <w:t>other programs</w:t>
+      </w:r>
+      <w:r>
+        <w:t>.</w:t>
       </w:r>
     </w:p>
     <w:p>
       <w:r>
+        <w:rPr>
+          <w:noProof/>
+        </w:rPr>
+        <w:lastRenderedPageBreak/>
         <w:drawing>
-          <wp:inline distT="0" distB="0" distL="0" distR="0" wp14:anchorId="422E1B17" wp14:editId="351B4704">
+          <wp:inline distT="0" distB="0" distL="0" distR="0" wp14:anchorId="68C4202C" wp14:editId="6669F6CA">
             <wp:extent cx="5760720" cy="3178810"/>
             <wp:effectExtent l="0" t="0" r="0" b="2540"/>
-            <wp:docPr id="929415108" name="Grafik 1"/>
+            <wp:docPr id="1965369061" name="Grafik 1"/>
             <wp:cNvGraphicFramePr>
               <a:graphicFrameLocks xmlns:a="http://schemas.openxmlformats.org/drawingml/2006/main" noChangeAspect="1"/>
             </wp:cNvGraphicFramePr>
@@ -995,7 +904,7 @@
               <a:graphicData uri="http://schemas.openxmlformats.org/drawingml/2006/picture">
                 <pic:pic xmlns:pic="http://schemas.openxmlformats.org/drawingml/2006/picture">
                   <pic:nvPicPr>
-                    <pic:cNvPr id="929415108" name=""/>
+                    <pic:cNvPr id="1965369061" name=""/>
                     <pic:cNvPicPr/>
                   </pic:nvPicPr>
                   <pic:blipFill>
@@ -1022,6 +931,154 @@
     </w:p>
     <w:p>
       <w:pPr>
+        <w:ind w:left="851"/>
+      </w:pPr>
+      <w:r>
+        <w:t xml:space="preserve">Next, we want to load a loose </w:t>
+      </w:r>
+      <w:r>
+        <w:t>t</w:t>
+      </w:r>
+      <w:r>
+        <w:t xml:space="preserve">ransition </w:t>
+      </w:r>
+      <w:r>
+        <w:t>s</w:t>
+      </w:r>
+      <w:r>
+        <w:t>tate. Use the button “</w:t>
+      </w:r>
+      <w:r>
+        <w:rPr>
+          <w:b/>
+          <w:bCs/>
+        </w:rPr>
+        <w:t>Load loose TS Fragment 1</w:t>
+      </w:r>
+      <w:r>
+        <w:t>” and choose the Gaussian log</w:t>
+      </w:r>
+      <w:r>
+        <w:t>-</w:t>
+      </w:r>
+      <w:r>
+        <w:t xml:space="preserve">file of the first </w:t>
+      </w:r>
+      <w:r>
+        <w:t>f</w:t>
+      </w:r>
+      <w:r>
+        <w:t>ragment, “</w:t>
+      </w:r>
+      <w:r>
+        <w:rPr>
+          <w:b/>
+          <w:bCs/>
+        </w:rPr>
+        <w:t>co3.com.log</w:t>
+      </w:r>
+      <w:r>
+        <w:t>”. A new panel called “TS</w:t>
+      </w:r>
+      <w:r>
+        <w:t> </w:t>
+      </w:r>
+      <w:r>
+        <w:t>0” appears</w:t>
+      </w:r>
+      <w:r>
+        <w:t>. Again, this panel</w:t>
+      </w:r>
+      <w:r>
+        <w:t xml:space="preserve"> contain</w:t>
+      </w:r>
+      <w:r>
+        <w:t>s</w:t>
+      </w:r>
+      <w:r>
+        <w:t xml:space="preserve"> all information</w:t>
+      </w:r>
+      <w:r>
+        <w:t xml:space="preserve"> about the first fragment which </w:t>
+      </w:r>
+      <w:r>
+        <w:t xml:space="preserve">AWATAR </w:t>
+      </w:r>
+      <w:r>
+        <w:t>will need</w:t>
+      </w:r>
+      <w:r>
+        <w:t xml:space="preserve"> for calculations</w:t>
+      </w:r>
+      <w:r>
+        <w:t>,</w:t>
+      </w:r>
+      <w:r>
+        <w:t xml:space="preserve"> </w:t>
+      </w:r>
+      <w:r>
+        <w:t>namely the vibrational frequencies</w:t>
+      </w:r>
+      <w:r>
+        <w:t>,</w:t>
+      </w:r>
+      <w:r>
+        <w:t xml:space="preserve"> the rotational constants</w:t>
+      </w:r>
+      <w:r>
+        <w:t>,</w:t>
+      </w:r>
+      <w:r>
+        <w:t xml:space="preserve"> the rotational symmetry number, and the energy and degeneracy</w:t>
+      </w:r>
+      <w:r>
+        <w:t>:</w:t>
+      </w:r>
+    </w:p>
+    <w:p>
+      <w:r>
+        <w:rPr>
+          <w:noProof/>
+        </w:rPr>
+        <w:drawing>
+          <wp:inline distT="0" distB="0" distL="0" distR="0" wp14:anchorId="422E1B17" wp14:editId="351B4704">
+            <wp:extent cx="5760720" cy="3178810"/>
+            <wp:effectExtent l="0" t="0" r="0" b="2540"/>
+            <wp:docPr id="929415108" name="Grafik 1"/>
+            <wp:cNvGraphicFramePr>
+              <a:graphicFrameLocks xmlns:a="http://schemas.openxmlformats.org/drawingml/2006/main" noChangeAspect="1"/>
+            </wp:cNvGraphicFramePr>
+            <a:graphic xmlns:a="http://schemas.openxmlformats.org/drawingml/2006/main">
+              <a:graphicData uri="http://schemas.openxmlformats.org/drawingml/2006/picture">
+                <pic:pic xmlns:pic="http://schemas.openxmlformats.org/drawingml/2006/picture">
+                  <pic:nvPicPr>
+                    <pic:cNvPr id="929415108" name=""/>
+                    <pic:cNvPicPr/>
+                  </pic:nvPicPr>
+                  <pic:blipFill>
+                    <a:blip r:embed="rId13"/>
+                    <a:stretch>
+                      <a:fillRect/>
+                    </a:stretch>
+                  </pic:blipFill>
+                  <pic:spPr>
+                    <a:xfrm>
+                      <a:off x="0" y="0"/>
+                      <a:ext cx="5760720" cy="3178810"/>
+                    </a:xfrm>
+                    <a:prstGeom prst="rect">
+                      <a:avLst/>
+                    </a:prstGeom>
+                  </pic:spPr>
+                </pic:pic>
+              </a:graphicData>
+            </a:graphic>
+          </wp:inline>
+        </w:drawing>
+      </w:r>
+    </w:p>
+    <w:p>
+      <w:pPr>
         <w:pStyle w:val="Listenabsatz"/>
         <w:numPr>
           <w:ilvl w:val="0"/>
@@ -1114,7 +1171,6 @@
         <w:rPr>
           <w:noProof/>
         </w:rPr>
-        <w:lastRenderedPageBreak/>
         <w:drawing>
           <wp:inline distT="0" distB="0" distL="0" distR="0" wp14:anchorId="619594BA" wp14:editId="42779C81">
             <wp:extent cx="4725059" cy="1314633"/>
@@ -1131,7 +1187,7 @@
                     <pic:cNvPicPr/>
                   </pic:nvPicPr>
                   <pic:blipFill>
-                    <a:blip r:embed="rId13"/>
+                    <a:blip r:embed="rId14"/>
                     <a:stretch>
                       <a:fillRect/>
                     </a:stretch>
@@ -1165,6 +1221,9 @@
     </w:p>
     <w:p>
       <w:r>
+        <w:rPr>
+          <w:noProof/>
+        </w:rPr>
         <w:drawing>
           <wp:inline distT="0" distB="0" distL="0" distR="0" wp14:anchorId="48756939" wp14:editId="7F611F96">
             <wp:extent cx="5760720" cy="3178810"/>
@@ -1178,152 +1237,6 @@
                 <pic:pic xmlns:pic="http://schemas.openxmlformats.org/drawingml/2006/picture">
                   <pic:nvPicPr>
                     <pic:cNvPr id="1095697207" name=""/>
-                    <pic:cNvPicPr/>
-                  </pic:nvPicPr>
-                  <pic:blipFill>
-                    <a:blip r:embed="rId14"/>
-                    <a:stretch>
-                      <a:fillRect/>
-                    </a:stretch>
-                  </pic:blipFill>
-                  <pic:spPr>
-                    <a:xfrm>
-                      <a:off x="0" y="0"/>
-                      <a:ext cx="5760720" cy="3178810"/>
-                    </a:xfrm>
-                    <a:prstGeom prst="rect">
-                      <a:avLst/>
-                    </a:prstGeom>
-                  </pic:spPr>
-                </pic:pic>
-              </a:graphicData>
-            </a:graphic>
-          </wp:inline>
-        </w:drawing>
-      </w:r>
-    </w:p>
-    <w:p>
-      <w:pPr>
-        <w:pStyle w:val="Listenabsatz"/>
-        <w:numPr>
-          <w:ilvl w:val="0"/>
-          <w:numId w:val="11"/>
-        </w:numPr>
-      </w:pPr>
-      <w:r>
-        <w:t xml:space="preserve">Now the </w:t>
-      </w:r>
-      <w:r>
-        <w:t>s</w:t>
-      </w:r>
-      <w:r>
-        <w:t xml:space="preserve">um of </w:t>
-      </w:r>
-      <w:r>
-        <w:t>s</w:t>
-      </w:r>
-      <w:r>
-        <w:t xml:space="preserve">tates of </w:t>
-      </w:r>
-      <w:r>
-        <w:t xml:space="preserve">TS 0 </w:t>
-      </w:r>
-      <w:r>
-        <w:t>can be calculated using the button “</w:t>
-      </w:r>
-      <w:r>
-        <w:rPr>
-          <w:b/>
-          <w:bCs/>
-        </w:rPr>
-        <w:t>Calculate SoS</w:t>
-      </w:r>
-      <w:r>
-        <w:t>”</w:t>
-      </w:r>
-      <w:r>
-        <w:t>.</w:t>
-      </w:r>
-      <w:r>
-        <w:t xml:space="preserve"> AWATAR then reads the information from the panel “Parameters”, “TS 0” and “Well 0”. It calculates the relative energy of the transition state </w:t>
-      </w:r>
-      <w:r>
-        <w:t xml:space="preserve">with respect </w:t>
-      </w:r>
-      <w:r>
-        <w:t xml:space="preserve">to the global minimum (in this case “Well 0”), and then determines the sum of states as described in Ref </w:t>
-      </w:r>
-      <w:sdt>
-        <w:sdtPr>
-          <w:alias w:val="To edit, see citavi.com/edit"/>
-          <w:tag w:val="CitaviPlaceholder#ab586a0f-6fc5-4b99-a816-b46fde125cb6"/>
-          <w:id w:val="948814320"/>
-          <w:placeholder>
-            <w:docPart w:val="DefaultPlaceholder_-1854013440"/>
-          </w:placeholder>
-        </w:sdtPr>
-        <w:sdtContent>
-          <w:r>
-            <w:fldChar w:fldCharType="begin"/>
-          </w:r>
-          <w:r>
-            <w:instrText>ADDIN CitaviPlaceholder{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}</w:instrText>
-          </w:r>
-          <w:r>
-            <w:fldChar w:fldCharType="separate"/>
-          </w:r>
-          <w:r>
-            <w:t>2</w:t>
-          </w:r>
-          <w:r>
-            <w:fldChar w:fldCharType="end"/>
-          </w:r>
-        </w:sdtContent>
-      </w:sdt>
-      <w:r>
-        <w:t xml:space="preserve">. </w:t>
-      </w:r>
-      <w:r>
-        <w:t>The result</w:t>
-      </w:r>
-      <w:r>
-        <w:t xml:space="preserve">s </w:t>
-      </w:r>
-      <w:r>
-        <w:t>appear in the panel “Results”</w:t>
-      </w:r>
-      <w:r>
-        <w:t xml:space="preserve"> in dependence of the energy, whereby the global minimum defines the zero of the energy</w:t>
-      </w:r>
-      <w:r>
-        <w:t xml:space="preserve"> scale</w:t>
-      </w:r>
-      <w:r>
-        <w:t xml:space="preserve">. Note that the sum of states is zero </w:t>
-      </w:r>
-      <w:r>
-        <w:t xml:space="preserve">below </w:t>
-      </w:r>
-      <w:r>
-        <w:t>the energy of the transition state.</w:t>
-      </w:r>
-    </w:p>
-    <w:p>
-      <w:r>
-        <w:lastRenderedPageBreak/>
-        <w:drawing>
-          <wp:inline distT="0" distB="0" distL="0" distR="0" wp14:anchorId="466686FF" wp14:editId="2DF7327B">
-            <wp:extent cx="5760720" cy="3178810"/>
-            <wp:effectExtent l="0" t="0" r="0" b="2540"/>
-            <wp:docPr id="1479548499" name="Grafik 1"/>
-            <wp:cNvGraphicFramePr>
-              <a:graphicFrameLocks xmlns:a="http://schemas.openxmlformats.org/drawingml/2006/main" noChangeAspect="1"/>
-            </wp:cNvGraphicFramePr>
-            <a:graphic xmlns:a="http://schemas.openxmlformats.org/drawingml/2006/main">
-              <a:graphicData uri="http://schemas.openxmlformats.org/drawingml/2006/picture">
-                <pic:pic xmlns:pic="http://schemas.openxmlformats.org/drawingml/2006/picture">
-                  <pic:nvPicPr>
-                    <pic:cNvPr id="1479548499" name=""/>
                     <pic:cNvPicPr/>
                   </pic:nvPicPr>
                   <pic:blipFill>
@@ -1357,55 +1270,114 @@
         </w:numPr>
       </w:pPr>
       <w:r>
-        <w:t xml:space="preserve">Next, we want to calculate </w:t>
+        <w:t xml:space="preserve">Now the </w:t>
+      </w:r>
+      <w:r>
+        <w:t>s</w:t>
+      </w:r>
+      <w:r>
+        <w:t xml:space="preserve">um of </w:t>
+      </w:r>
+      <w:r>
+        <w:t>s</w:t>
+      </w:r>
+      <w:r>
+        <w:t xml:space="preserve">tates of </w:t>
+      </w:r>
+      <w:r>
+        <w:t xml:space="preserve">TS 0 </w:t>
+      </w:r>
+      <w:r>
+        <w:t>can be calculated using the button “</w:t>
       </w:r>
       <w:r>
         <w:rPr>
           <w:b/>
           <w:bCs/>
         </w:rPr>
-        <w:t>RRKM rate</w:t>
-      </w:r>
-      <w:r>
-        <w:rPr>
-          <w:b/>
-          <w:bCs/>
-        </w:rPr>
-        <w:t xml:space="preserve"> constant</w:t>
-      </w:r>
-      <w:r>
-        <w:rPr>
-          <w:b/>
-          <w:bCs/>
-        </w:rPr>
-        <w:t>s</w:t>
+        <w:t>Calculate SoS</w:t>
+      </w:r>
+      <w:r>
+        <w:t>”</w:t>
       </w:r>
       <w:r>
         <w:t>.</w:t>
       </w:r>
       <w:r>
-        <w:t xml:space="preserve"> </w:t>
-      </w:r>
-      <w:r>
-        <w:t>The required p</w:t>
-      </w:r>
-      <w:r>
-        <w:t>arameters</w:t>
-      </w:r>
-      <w:r>
-        <w:t xml:space="preserve"> are defined in </w:t>
-      </w:r>
-      <w:r>
-        <w:t xml:space="preserve">the section “Reaction channels”: </w:t>
+        <w:t xml:space="preserve"> AWATAR then reads the information from the panel “Parameters”, “TS 0” and “Well 0”. It calculates the relative energy of the transition state </w:t>
+      </w:r>
+      <w:r>
+        <w:t xml:space="preserve">with respect </w:t>
+      </w:r>
+      <w:r>
+        <w:t xml:space="preserve">to the global minimum (in this case “Well 0”), and then determines the sum of states as described in Ref </w:t>
+      </w:r>
+      <w:sdt>
+        <w:sdtPr>
+          <w:alias w:val="To edit, see citavi.com/edit"/>
+          <w:tag w:val="CitaviPlaceholder#ab586a0f-6fc5-4b99-a816-b46fde125cb6"/>
+          <w:id w:val="948814320"/>
+          <w:placeholder>
+            <w:docPart w:val="DefaultPlaceholder_-1854013440"/>
+          </w:placeholder>
+        </w:sdtPr>
+        <w:sdtEndPr/>
+        <w:sdtContent>
+          <w:r>
+            <w:fldChar w:fldCharType="begin"/>
+          </w:r>
+          <w:r>
+            <w:instrText>ADDIN CitaviPlaceholder{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}</w:instrText>
+          </w:r>
+          <w:r>
+            <w:fldChar w:fldCharType="separate"/>
+          </w:r>
+          <w:r>
+            <w:t>2</w:t>
+          </w:r>
+          <w:r>
+            <w:fldChar w:fldCharType="end"/>
+          </w:r>
+        </w:sdtContent>
+      </w:sdt>
+      <w:r>
+        <w:t xml:space="preserve">. </w:t>
+      </w:r>
+      <w:r>
+        <w:t>The result</w:t>
+      </w:r>
+      <w:r>
+        <w:t xml:space="preserve">s </w:t>
+      </w:r>
+      <w:r>
+        <w:t>appear in the panel “Results”</w:t>
+      </w:r>
+      <w:r>
+        <w:t xml:space="preserve"> in dependence of the energy, whereby the global minimum defines the zero of the energy</w:t>
+      </w:r>
+      <w:r>
+        <w:t xml:space="preserve"> scale</w:t>
+      </w:r>
+      <w:r>
+        <w:t xml:space="preserve">. Note that the sum of states is zero </w:t>
+      </w:r>
+      <w:r>
+        <w:t xml:space="preserve">below </w:t>
+      </w:r>
+      <w:r>
+        <w:t>the energy of the transition state.</w:t>
       </w:r>
     </w:p>
     <w:p>
       <w:r>
+        <w:rPr>
+          <w:noProof/>
+        </w:rPr>
         <w:drawing>
-          <wp:inline distT="0" distB="0" distL="0" distR="0" wp14:anchorId="4C1BA581" wp14:editId="283A1F83">
+          <wp:inline distT="0" distB="0" distL="0" distR="0" wp14:anchorId="466686FF" wp14:editId="2DF7327B">
             <wp:extent cx="5760720" cy="3178810"/>
             <wp:effectExtent l="0" t="0" r="0" b="2540"/>
-            <wp:docPr id="1305333737" name="Grafik 1"/>
+            <wp:docPr id="1479548499" name="Grafik 1"/>
             <wp:cNvGraphicFramePr>
               <a:graphicFrameLocks xmlns:a="http://schemas.openxmlformats.org/drawingml/2006/main" noChangeAspect="1"/>
             </wp:cNvGraphicFramePr>
@@ -1413,7 +1385,7 @@
               <a:graphicData uri="http://schemas.openxmlformats.org/drawingml/2006/picture">
                 <pic:pic xmlns:pic="http://schemas.openxmlformats.org/drawingml/2006/picture">
                   <pic:nvPicPr>
-                    <pic:cNvPr id="1305333737" name=""/>
+                    <pic:cNvPr id="1479548499" name=""/>
                     <pic:cNvPicPr/>
                   </pic:nvPicPr>
                   <pic:blipFill>
@@ -1440,119 +1412,65 @@
     </w:p>
     <w:p>
       <w:pPr>
-        <w:ind w:left="360"/>
-        <w:jc w:val="both"/>
-      </w:pPr>
-      <w:r>
-        <w:t>The default channel is “</w:t>
+        <w:pStyle w:val="Listenabsatz"/>
+        <w:numPr>
+          <w:ilvl w:val="0"/>
+          <w:numId w:val="11"/>
+        </w:numPr>
+      </w:pPr>
+      <w:r>
+        <w:t xml:space="preserve">Next, we want to calculate </w:t>
       </w:r>
       <w:r>
         <w:rPr>
           <w:b/>
           <w:bCs/>
         </w:rPr>
-        <w:t>Channel 0 Well all TS all</w:t>
-      </w:r>
-      <w:r>
-        <w:t xml:space="preserve">” which means, that the </w:t>
-      </w:r>
-      <w:r>
-        <w:t>RRKM</w:t>
-      </w:r>
-      <w:r>
-        <w:t xml:space="preserve"> </w:t>
-      </w:r>
-      <w:r>
-        <w:t>rate</w:t>
-      </w:r>
-      <w:r>
-        <w:t xml:space="preserve"> constant</w:t>
-      </w:r>
-      <w:r>
-        <w:t>s are calculated using the density of states of all wells and the sum of states of all transition states.</w:t>
-      </w:r>
-      <w:sdt>
-        <w:sdtPr>
-          <w:alias w:val="To edit, see citavi.com/edit"/>
-          <w:tag w:val="CitaviPlaceholder#5533f7af-a666-4600-acd1-f0ee0f65fac6"/>
-          <w:id w:val="-1480372228"/>
-          <w:placeholder>
-            <w:docPart w:val="DefaultPlaceholder_-1854013440"/>
-          </w:placeholder>
-        </w:sdtPr>
-        <w:sdtContent>
-          <w:r>
-            <w:fldChar w:fldCharType="begin"/>
-          </w:r>
-          <w:r>
-            <w:instrText>ADDIN CitaviPlaceholder{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}</w:instrText>
-          </w:r>
-          <w:r>
-            <w:fldChar w:fldCharType="separate"/>
-          </w:r>
-          <w:r>
-            <w:rPr>
-              <w:vertAlign w:val="superscript"/>
-            </w:rPr>
-            <w:t>3</w:t>
-          </w:r>
-          <w:r>
-            <w:fldChar w:fldCharType="end"/>
-          </w:r>
-        </w:sdtContent>
-      </w:sdt>
-      <w:r>
-        <w:t xml:space="preserve"> Other possible channel definitions are inactive, as the other lines start with a semicolon “;” and all text after semicolons is treated as a comment by the program. For our example calculation, we just use the default settings and do not change the panel “Parameters”. Click on the button “</w:t>
+        <w:t>RRKM rate</w:t>
       </w:r>
       <w:r>
         <w:rPr>
           <w:b/>
           <w:bCs/>
         </w:rPr>
-        <w:t>RRKM</w:t>
+        <w:t xml:space="preserve"> constant</w:t>
       </w:r>
       <w:r>
         <w:rPr>
           <w:b/>
           <w:bCs/>
         </w:rPr>
-        <w:t xml:space="preserve"> R</w:t>
-      </w:r>
-      <w:r>
-        <w:rPr>
-          <w:b/>
-          <w:bCs/>
-        </w:rPr>
-        <w:t>ate</w:t>
-      </w:r>
-      <w:r>
-        <w:rPr>
-          <w:b/>
-          <w:bCs/>
-        </w:rPr>
-        <w:t xml:space="preserve"> Constants</w:t>
-      </w:r>
-      <w:r>
-        <w:t xml:space="preserve">”, and the results of the calculation are again written to the </w:t>
-      </w:r>
-      <w:r>
-        <w:t>p</w:t>
-      </w:r>
-      <w:r>
-        <w:t>anel “Results”:</w:t>
+        <w:t>s</w:t>
+      </w:r>
+      <w:r>
+        <w:t>.</w:t>
+      </w:r>
+      <w:r>
+        <w:t xml:space="preserve"> </w:t>
+      </w:r>
+      <w:r>
+        <w:t>The required p</w:t>
+      </w:r>
+      <w:r>
+        <w:t>arameters</w:t>
+      </w:r>
+      <w:r>
+        <w:t xml:space="preserve"> are defined in </w:t>
+      </w:r>
+      <w:r>
+        <w:t xml:space="preserve">the section “Reaction channels”: </w:t>
       </w:r>
     </w:p>
     <w:p>
-      <w:pPr>
-        <w:ind w:left="360"/>
-      </w:pPr>
-      <w:r>
-        <w:lastRenderedPageBreak/>
+      <w:r>
+        <w:rPr>
+          <w:noProof/>
+        </w:rPr>
         <w:drawing>
-          <wp:inline distT="0" distB="0" distL="0" distR="0" wp14:anchorId="1AC0DCEA" wp14:editId="67B56C87">
+          <wp:inline distT="0" distB="0" distL="0" distR="0" wp14:anchorId="4C1BA581" wp14:editId="283A1F83">
             <wp:extent cx="5760720" cy="3178810"/>
             <wp:effectExtent l="0" t="0" r="0" b="2540"/>
-            <wp:docPr id="2083045466" name="Grafik 1"/>
+            <wp:docPr id="1305333737" name="Grafik 1"/>
             <wp:cNvGraphicFramePr>
               <a:graphicFrameLocks xmlns:a="http://schemas.openxmlformats.org/drawingml/2006/main" noChangeAspect="1"/>
             </wp:cNvGraphicFramePr>
@@ -1560,7 +1478,7 @@
               <a:graphicData uri="http://schemas.openxmlformats.org/drawingml/2006/picture">
                 <pic:pic xmlns:pic="http://schemas.openxmlformats.org/drawingml/2006/picture">
                   <pic:nvPicPr>
-                    <pic:cNvPr id="2083045466" name=""/>
+                    <pic:cNvPr id="1305333737" name=""/>
                     <pic:cNvPicPr/>
                   </pic:nvPicPr>
                   <pic:blipFill>
@@ -1588,9 +1506,20 @@
     <w:p>
       <w:pPr>
         <w:ind w:left="360"/>
-      </w:pPr>
-      <w:r>
-        <w:t xml:space="preserve">Note, that the </w:t>
+        <w:jc w:val="both"/>
+      </w:pPr>
+      <w:r>
+        <w:t>The default channel is “</w:t>
+      </w:r>
+      <w:r>
+        <w:rPr>
+          <w:b/>
+          <w:bCs/>
+        </w:rPr>
+        <w:t>Channel 0 Well all TS all</w:t>
+      </w:r>
+      <w:r>
+        <w:t xml:space="preserve">” which means, that the </w:t>
       </w:r>
       <w:r>
         <w:t>RRKM</w:t>
@@ -1605,206 +1534,93 @@
         <w:t xml:space="preserve"> constant</w:t>
       </w:r>
       <w:r>
-        <w:t>s</w:t>
-      </w:r>
-      <w:r>
-        <w:t xml:space="preserve"> (</w:t>
-      </w:r>
-      <w:r>
-        <w:t>second</w:t>
-      </w:r>
-      <w:r>
-        <w:t xml:space="preserve"> </w:t>
-      </w:r>
-      <w:r>
-        <w:t>column</w:t>
-      </w:r>
-      <w:r>
-        <w:t>)</w:t>
-      </w:r>
-      <w:r>
-        <w:t xml:space="preserve"> are </w:t>
-      </w:r>
-      <w:r>
-        <w:t xml:space="preserve">zero </w:t>
-      </w:r>
-      <w:r>
-        <w:t xml:space="preserve">for all energies </w:t>
-      </w:r>
-      <w:r>
-        <w:t>below the activation energy</w:t>
-      </w:r>
-      <w:r>
-        <w:t xml:space="preserve"> and rise fast above it.</w:t>
+        <w:t>s are calculated using the density of states of all wells and the sum of states of all transition states.</w:t>
+      </w:r>
+      <w:sdt>
+        <w:sdtPr>
+          <w:alias w:val="To edit, see citavi.com/edit"/>
+          <w:tag w:val="CitaviPlaceholder#5533f7af-a666-4600-acd1-f0ee0f65fac6"/>
+          <w:id w:val="-1480372228"/>
+          <w:placeholder>
+            <w:docPart w:val="DefaultPlaceholder_-1854013440"/>
+          </w:placeholder>
+        </w:sdtPr>
+        <w:sdtEndPr/>
+        <w:sdtContent>
+          <w:r>
+            <w:fldChar w:fldCharType="begin"/>
+          </w:r>
+          <w:r>
+            <w:instrText>ADDIN CitaviPlaceholder{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}</w:instrText>
+          </w:r>
+          <w:r>
+            <w:fldChar w:fldCharType="separate"/>
+          </w:r>
+          <w:r>
+            <w:rPr>
+              <w:vertAlign w:val="superscript"/>
+            </w:rPr>
+            <w:t>3</w:t>
+          </w:r>
+          <w:r>
+            <w:fldChar w:fldCharType="end"/>
+          </w:r>
+        </w:sdtContent>
+      </w:sdt>
+      <w:r>
+        <w:t xml:space="preserve"> Other possible channel definitions are inactive, as the other lines start with a semicolon “;” and all text after semicolons is treated as a comment by the program. For our example calculation, we just use the default settings and do not change the panel “Parameters”. Click on the button “</w:t>
+      </w:r>
+      <w:r>
+        <w:rPr>
+          <w:b/>
+          <w:bCs/>
+        </w:rPr>
+        <w:t>RRKM</w:t>
+      </w:r>
+      <w:r>
+        <w:rPr>
+          <w:b/>
+          <w:bCs/>
+        </w:rPr>
+        <w:t xml:space="preserve"> R</w:t>
+      </w:r>
+      <w:r>
+        <w:rPr>
+          <w:b/>
+          <w:bCs/>
+        </w:rPr>
+        <w:t>ate</w:t>
+      </w:r>
+      <w:r>
+        <w:rPr>
+          <w:b/>
+          <w:bCs/>
+        </w:rPr>
+        <w:t xml:space="preserve"> Constants</w:t>
+      </w:r>
+      <w:r>
+        <w:t xml:space="preserve">”, and the results of the calculation are again written to the </w:t>
+      </w:r>
+      <w:r>
+        <w:t>p</w:t>
+      </w:r>
+      <w:r>
+        <w:t>anel “Results”:</w:t>
       </w:r>
     </w:p>
     <w:p>
       <w:pPr>
-        <w:pStyle w:val="Listenabsatz"/>
-        <w:numPr>
-          <w:ilvl w:val="0"/>
-          <w:numId w:val="11"/>
-        </w:numPr>
         <w:ind w:left="360"/>
       </w:pPr>
       <w:r>
-        <w:t xml:space="preserve">Finally, we want to </w:t>
-      </w:r>
-      <w:r>
-        <w:rPr>
-          <w:bCs/>
-        </w:rPr>
-        <w:t>perform</w:t>
-      </w:r>
-      <w:r>
-        <w:rPr>
-          <w:b/>
-          <w:bCs/>
-        </w:rPr>
-        <w:t xml:space="preserve"> </w:t>
-      </w:r>
-      <w:r>
-        <w:rPr>
-          <w:b/>
-          <w:bCs/>
-        </w:rPr>
-        <w:t>Master Equation Modeling (</w:t>
-      </w:r>
-      <w:r>
-        <w:rPr>
-          <w:b/>
-          <w:bCs/>
-        </w:rPr>
-        <w:t>MEM</w:t>
-      </w:r>
-      <w:r>
-        <w:rPr>
-          <w:b/>
-          <w:bCs/>
-        </w:rPr>
-        <w:t>)</w:t>
-      </w:r>
-      <w:r>
-        <w:t>. As an example, we calculate real time MEM for BIRD</w:t>
-      </w:r>
-      <w:r>
-        <w:t xml:space="preserve"> </w:t>
-      </w:r>
-      <w:r>
-        <w:t>conditions, with</w:t>
-      </w:r>
-      <w:r>
-        <w:t>out</w:t>
-      </w:r>
-      <w:r>
-        <w:t xml:space="preserve"> IRMPD source. Let’s have a look at </w:t>
-      </w:r>
-      <w:r>
-        <w:t>the</w:t>
-      </w:r>
-      <w:r>
-        <w:rPr>
-          <w:b/>
-          <w:bCs/>
-        </w:rPr>
-        <w:t xml:space="preserve"> Definitions for </w:t>
-      </w:r>
-      <w:r>
-        <w:rPr>
-          <w:b/>
-          <w:bCs/>
-        </w:rPr>
-        <w:t>m</w:t>
-      </w:r>
-      <w:r>
-        <w:rPr>
-          <w:b/>
-          <w:bCs/>
-        </w:rPr>
-        <w:t xml:space="preserve">aster </w:t>
-      </w:r>
-      <w:r>
-        <w:rPr>
-          <w:b/>
-          <w:bCs/>
-        </w:rPr>
-        <w:t>e</w:t>
-      </w:r>
-      <w:r>
-        <w:rPr>
-          <w:b/>
-          <w:bCs/>
-        </w:rPr>
-        <w:t xml:space="preserve">quation </w:t>
-      </w:r>
-      <w:r>
-        <w:rPr>
-          <w:b/>
-          <w:bCs/>
-        </w:rPr>
-        <w:t>m</w:t>
-      </w:r>
-      <w:r>
-        <w:rPr>
-          <w:b/>
-          <w:bCs/>
-        </w:rPr>
-        <w:t>odelling (MEM)</w:t>
-      </w:r>
-      <w:r>
-        <w:t xml:space="preserve"> in the panel</w:t>
-      </w:r>
-      <w:r>
-        <w:t xml:space="preserve"> “Parameters”</w:t>
-      </w:r>
-      <w:r>
-        <w:t>:</w:t>
-      </w:r>
-      <w:r>
-        <w:t xml:space="preserve"> The BIRD parameters define the temperature of the environment. The default is, to perform MEM for 3 different </w:t>
-      </w:r>
-      <w:r>
-        <w:t>environment-</w:t>
-      </w:r>
-      <w:r>
-        <w:t xml:space="preserve">temperatures between 200 K and 300 K. Let’s say, we want to </w:t>
-      </w:r>
-      <w:r>
-        <w:t xml:space="preserve">perform MEM </w:t>
-      </w:r>
-      <w:r>
-        <w:t>just for one temperature of the environment (300 K), so we change the “Number of temperatures in loop” to 1</w:t>
-      </w:r>
-      <w:r>
-        <w:t xml:space="preserve"> and</w:t>
-      </w:r>
-      <w:r>
-        <w:t xml:space="preserve"> activate the line starting with “Manual list for temperatures in loop” by removing the semicolon in front of it. Instead of the three example numbers, write 300, as 300 K is the temperature of our environment. </w:t>
-      </w:r>
-      <w:r>
-        <w:t>IRMPD is per default inactive, so there is no need to change anything there. In the “Real time MEM parameters</w:t>
-      </w:r>
-      <w:r>
-        <w:t>”</w:t>
-      </w:r>
-      <w:r>
-        <w:t xml:space="preserve">, we can set the initial temperature of the molecules to for example </w:t>
-      </w:r>
-      <w:r>
-        <w:t>3</w:t>
-      </w:r>
-      <w:r>
-        <w:t>50 K.</w:t>
-      </w:r>
-    </w:p>
-    <w:p>
-      <w:r>
-        <w:lastRenderedPageBreak/>
+        <w:rPr>
+          <w:noProof/>
+        </w:rPr>
         <w:drawing>
-          <wp:inline distT="0" distB="0" distL="0" distR="0" wp14:anchorId="365EDE54" wp14:editId="49C32F32">
+          <wp:inline distT="0" distB="0" distL="0" distR="0" wp14:anchorId="1AC0DCEA" wp14:editId="67B56C87">
             <wp:extent cx="5760720" cy="3178810"/>
             <wp:effectExtent l="0" t="0" r="0" b="2540"/>
-            <wp:docPr id="990366767" name="Grafik 1"/>
+            <wp:docPr id="2083045466" name="Grafik 1"/>
             <wp:cNvGraphicFramePr>
               <a:graphicFrameLocks xmlns:a="http://schemas.openxmlformats.org/drawingml/2006/main" noChangeAspect="1"/>
             </wp:cNvGraphicFramePr>
@@ -1812,7 +1628,7 @@
               <a:graphicData uri="http://schemas.openxmlformats.org/drawingml/2006/picture">
                 <pic:pic xmlns:pic="http://schemas.openxmlformats.org/drawingml/2006/picture">
                   <pic:nvPicPr>
-                    <pic:cNvPr id="990366767" name=""/>
+                    <pic:cNvPr id="2083045466" name=""/>
                     <pic:cNvPicPr/>
                   </pic:nvPicPr>
                   <pic:blipFill>
@@ -1836,6 +1652,260 @@
           </wp:inline>
         </w:drawing>
       </w:r>
+    </w:p>
+    <w:p>
+      <w:pPr>
+        <w:ind w:left="360"/>
+      </w:pPr>
+      <w:r>
+        <w:t xml:space="preserve">Note, that the </w:t>
+      </w:r>
+      <w:r>
+        <w:t>RRKM</w:t>
+      </w:r>
+      <w:r>
+        <w:t xml:space="preserve"> </w:t>
+      </w:r>
+      <w:r>
+        <w:t>rate</w:t>
+      </w:r>
+      <w:r>
+        <w:t xml:space="preserve"> constant</w:t>
+      </w:r>
+      <w:r>
+        <w:t>s</w:t>
+      </w:r>
+      <w:r>
+        <w:t xml:space="preserve"> (</w:t>
+      </w:r>
+      <w:r>
+        <w:t>second</w:t>
+      </w:r>
+      <w:r>
+        <w:t xml:space="preserve"> </w:t>
+      </w:r>
+      <w:r>
+        <w:t>column</w:t>
+      </w:r>
+      <w:r>
+        <w:t>)</w:t>
+      </w:r>
+      <w:r>
+        <w:t xml:space="preserve"> are </w:t>
+      </w:r>
+      <w:r>
+        <w:t xml:space="preserve">zero </w:t>
+      </w:r>
+      <w:r>
+        <w:t xml:space="preserve">for all energies </w:t>
+      </w:r>
+      <w:r>
+        <w:t>below the activation energy</w:t>
+      </w:r>
+      <w:r>
+        <w:t xml:space="preserve"> and rise fast above it.</w:t>
+      </w:r>
+    </w:p>
+    <w:p>
+      <w:pPr>
+        <w:pStyle w:val="Listenabsatz"/>
+        <w:numPr>
+          <w:ilvl w:val="0"/>
+          <w:numId w:val="11"/>
+        </w:numPr>
+        <w:ind w:left="360"/>
+      </w:pPr>
+      <w:r>
+        <w:t xml:space="preserve">Finally, we want to </w:t>
+      </w:r>
+      <w:r>
+        <w:rPr>
+          <w:bCs/>
+        </w:rPr>
+        <w:t>perform</w:t>
+      </w:r>
+      <w:r>
+        <w:rPr>
+          <w:b/>
+          <w:bCs/>
+        </w:rPr>
+        <w:t xml:space="preserve"> </w:t>
+      </w:r>
+      <w:r>
+        <w:rPr>
+          <w:b/>
+          <w:bCs/>
+        </w:rPr>
+        <w:t>Master Equation Modeling (</w:t>
+      </w:r>
+      <w:r>
+        <w:rPr>
+          <w:b/>
+          <w:bCs/>
+        </w:rPr>
+        <w:t>MEM</w:t>
+      </w:r>
+      <w:r>
+        <w:rPr>
+          <w:b/>
+          <w:bCs/>
+        </w:rPr>
+        <w:t>)</w:t>
+      </w:r>
+      <w:r>
+        <w:t>. As an example, we calculate real time MEM for BIRD</w:t>
+      </w:r>
+      <w:r>
+        <w:t xml:space="preserve"> </w:t>
+      </w:r>
+      <w:r>
+        <w:t>conditions, with</w:t>
+      </w:r>
+      <w:r>
+        <w:t>out</w:t>
+      </w:r>
+      <w:r>
+        <w:t xml:space="preserve"> IRMPD source. Let’s have a look at </w:t>
+      </w:r>
+      <w:r>
+        <w:t>the</w:t>
+      </w:r>
+      <w:r>
+        <w:rPr>
+          <w:b/>
+          <w:bCs/>
+        </w:rPr>
+        <w:t xml:space="preserve"> Definitions for </w:t>
+      </w:r>
+      <w:r>
+        <w:rPr>
+          <w:b/>
+          <w:bCs/>
+        </w:rPr>
+        <w:t>m</w:t>
+      </w:r>
+      <w:r>
+        <w:rPr>
+          <w:b/>
+          <w:bCs/>
+        </w:rPr>
+        <w:t xml:space="preserve">aster </w:t>
+      </w:r>
+      <w:r>
+        <w:rPr>
+          <w:b/>
+          <w:bCs/>
+        </w:rPr>
+        <w:t>e</w:t>
+      </w:r>
+      <w:r>
+        <w:rPr>
+          <w:b/>
+          <w:bCs/>
+        </w:rPr>
+        <w:t xml:space="preserve">quation </w:t>
+      </w:r>
+      <w:r>
+        <w:rPr>
+          <w:b/>
+          <w:bCs/>
+        </w:rPr>
+        <w:t>m</w:t>
+      </w:r>
+      <w:r>
+        <w:rPr>
+          <w:b/>
+          <w:bCs/>
+        </w:rPr>
+        <w:t>odelling (MEM)</w:t>
+      </w:r>
+      <w:r>
+        <w:t xml:space="preserve"> in the panel</w:t>
+      </w:r>
+      <w:r>
+        <w:t xml:space="preserve"> “Parameters”</w:t>
+      </w:r>
+      <w:r>
+        <w:t>:</w:t>
+      </w:r>
+      <w:r>
+        <w:t xml:space="preserve"> The BIRD parameters define the temperature of the environment. The default is, to perform MEM for 3 different </w:t>
+      </w:r>
+      <w:r>
+        <w:t>environment-</w:t>
+      </w:r>
+      <w:r>
+        <w:t xml:space="preserve">temperatures between 200 K and 300 K. Let’s say, we want to </w:t>
+      </w:r>
+      <w:r>
+        <w:t xml:space="preserve">perform MEM </w:t>
+      </w:r>
+      <w:r>
+        <w:t>just for one temperature of the environment (300 K), so we change the “Number of temperatures in loop” to 1</w:t>
+      </w:r>
+      <w:r>
+        <w:t xml:space="preserve"> and</w:t>
+      </w:r>
+      <w:r>
+        <w:t xml:space="preserve"> activate the line starting with “Manual list for temperatures in loop” by removing the semicolon in front of it. Instead of the three example numbers, write 300, as 300 K is the temperature of our environment. </w:t>
+      </w:r>
+      <w:r>
+        <w:t>IRMPD is per default inactive, so there is no need to change anything there. In the “Real time MEM parameters</w:t>
+      </w:r>
+      <w:r>
+        <w:t>”</w:t>
+      </w:r>
+      <w:r>
+        <w:t xml:space="preserve">, we can set the initial temperature of the molecules to for example </w:t>
+      </w:r>
+      <w:r>
+        <w:t>3</w:t>
+      </w:r>
+      <w:r>
+        <w:t>50 K.</w:t>
+      </w:r>
+    </w:p>
+    <w:p>
+      <w:r>
+        <w:rPr>
+          <w:noProof/>
+        </w:rPr>
+        <w:drawing>
+          <wp:inline distT="0" distB="0" distL="0" distR="0" wp14:anchorId="365EDE54" wp14:editId="49C32F32">
+            <wp:extent cx="5760720" cy="3178810"/>
+            <wp:effectExtent l="0" t="0" r="0" b="2540"/>
+            <wp:docPr id="990366767" name="Grafik 1"/>
+            <wp:cNvGraphicFramePr>
+              <a:graphicFrameLocks xmlns:a="http://schemas.openxmlformats.org/drawingml/2006/main" noChangeAspect="1"/>
+            </wp:cNvGraphicFramePr>
+            <a:graphic xmlns:a="http://schemas.openxmlformats.org/drawingml/2006/main">
+              <a:graphicData uri="http://schemas.openxmlformats.org/drawingml/2006/picture">
+                <pic:pic xmlns:pic="http://schemas.openxmlformats.org/drawingml/2006/picture">
+                  <pic:nvPicPr>
+                    <pic:cNvPr id="990366767" name=""/>
+                    <pic:cNvPicPr/>
+                  </pic:nvPicPr>
+                  <pic:blipFill>
+                    <a:blip r:embed="rId19"/>
+                    <a:stretch>
+                      <a:fillRect/>
+                    </a:stretch>
+                  </pic:blipFill>
+                  <pic:spPr>
+                    <a:xfrm>
+                      <a:off x="0" y="0"/>
+                      <a:ext cx="5760720" cy="3178810"/>
+                    </a:xfrm>
+                    <a:prstGeom prst="rect">
+                      <a:avLst/>
+                    </a:prstGeom>
+                  </pic:spPr>
+                </pic:pic>
+              </a:graphicData>
+            </a:graphic>
+          </wp:inline>
+        </w:drawing>
+      </w:r>
       <w:r>
         <w:t xml:space="preserve"> </w:t>
       </w:r>
@@ -1904,7 +1974,7 @@
                     <pic:cNvPicPr/>
                   </pic:nvPicPr>
                   <pic:blipFill>
-                    <a:blip r:embed="rId19"/>
+                    <a:blip r:embed="rId20"/>
                     <a:stretch>
                       <a:fillRect/>
                     </a:stretch>
@@ -1932,7 +2002,9 @@
     </w:p>
     <w:p>
       <w:r>
-        <w:lastRenderedPageBreak/>
+        <w:rPr>
+          <w:noProof/>
+        </w:rPr>
         <w:drawing>
           <wp:inline distT="0" distB="0" distL="0" distR="0" wp14:anchorId="11FA1A16" wp14:editId="282429F5">
             <wp:extent cx="5760720" cy="3178810"/>
@@ -1949,7 +2021,7 @@
                     <pic:cNvPicPr/>
                   </pic:nvPicPr>
                   <pic:blipFill>
-                    <a:blip r:embed="rId20"/>
+                    <a:blip r:embed="rId21"/>
                     <a:stretch>
                       <a:fillRect/>
                     </a:stretch>
@@ -1971,7 +2043,7 @@
       </w:r>
     </w:p>
     <w:p>
-      <w:bookmarkStart w:id="0" w:name="_Hlk191970907"/>
+      <w:bookmarkStart w:id="1" w:name="_Hlk191970907"/>
       <w:r>
         <w:t xml:space="preserve">The first row gives the </w:t>
       </w:r>
@@ -2005,7 +2077,7 @@
       <w:r>
         <w:t xml:space="preserve">nergy of the population. </w:t>
       </w:r>
-      <w:bookmarkEnd w:id="0"/>
+      <w:bookmarkEnd w:id="1"/>
       <w:r>
         <w:t>One can see that the mean energy falls. This is due to the cooling to a lower temperature environment and due to the dissociation of the high energy part of the po</w:t>
       </w:r>
@@ -2121,6 +2193,7 @@
           <w:docPart w:val="DefaultPlaceholder_-1854013440"/>
         </w:placeholder>
       </w:sdtPr>
+      <w:sdtEndPr/>
       <w:sdtContent>
         <w:p>
           <w:pPr>
@@ -2146,11 +2219,11 @@
           <w:r>
             <w:t xml:space="preserve">(1) </w:t>
           </w:r>
-          <w:bookmarkStart w:id="1" w:name="_CTVL001d8923df2ec7b4381a25e557b062d3600"/>
+          <w:bookmarkStart w:id="2" w:name="_CTVL001d8923df2ec7b4381a25e557b062d3600"/>
           <w:r>
             <w:t>NIST Standard Reference Database 101.</w:t>
           </w:r>
-          <w:bookmarkEnd w:id="1"/>
+          <w:bookmarkEnd w:id="2"/>
           <w:r>
             <w:t xml:space="preserve"> </w:t>
           </w:r>
@@ -2171,11 +2244,11 @@
           <w:r>
             <w:t xml:space="preserve">(2) </w:t>
           </w:r>
-          <w:bookmarkStart w:id="2" w:name="_CTVL0014b8065bd3f0749c2864763d1ef06becf"/>
+          <w:bookmarkStart w:id="3" w:name="_CTVL0014b8065bd3f0749c2864763d1ef06becf"/>
           <w:r>
             <w:t>Gilbert, R. G.; Smith, S. C.</w:t>
           </w:r>
-          <w:bookmarkEnd w:id="2"/>
+          <w:bookmarkEnd w:id="3"/>
           <w:r>
             <w:t xml:space="preserve"> </w:t>
           </w:r>
@@ -2196,11 +2269,11 @@
           <w:r>
             <w:t xml:space="preserve">(3) </w:t>
           </w:r>
-          <w:bookmarkStart w:id="3" w:name="_CTVL001919e96e83c8f49beb6645d125c76fd3e"/>
+          <w:bookmarkStart w:id="4" w:name="_CTVL001919e96e83c8f49beb6645d125c76fd3e"/>
           <w:r>
             <w:t>Hartmann, J. C.; Madlener, S. J.; van der Linde, C.; Ončák, M.; Beyer, M. K. Magic Cluster Sizes of Cationic and Anionic Sodium Chloride Clusters Explained by Statistical Modelling of the Complete Phase Space.</w:t>
           </w:r>
-          <w:bookmarkEnd w:id="3"/>
+          <w:bookmarkEnd w:id="4"/>
           <w:r>
             <w:t xml:space="preserve"> </w:t>
           </w:r>
@@ -2239,7 +2312,7 @@
     </w:sdt>
     <w:p/>
     <w:sectPr>
-      <w:footerReference w:type="default" r:id="rId21"/>
+      <w:footerReference w:type="default" r:id="rId22"/>
       <w:pgSz w:w="11906" w:h="16838"/>
       <w:pgMar w:top="1417" w:right="1417" w:bottom="1134" w:left="1417" w:header="708" w:footer="708" w:gutter="0"/>
       <w:cols w:space="708"/>
@@ -2250,7 +2323,7 @@
 </file>
 
 <file path=word/endnotes.xml><?xml version="1.0" encoding="utf-8"?>
-<w:endnotes xmlns:wpc="http://schemas.microsoft.com/office/word/2010/wordprocessingCanvas" xmlns:cx="http://schemas.microsoft.com/office/drawing/2014/chartex" xmlns:cx1="http://schemas.microsoft.com/office/drawing/2015/9/8/chartex" xmlns:cx2="http://schemas.microsoft.com/office/drawing/2015/10/21/chartex" xmlns:cx3="http://schemas.microsoft.com/office/drawing/2016/5/9/chartex" xmlns:cx4="http://schemas.microsoft.com/office/drawing/2016/5/10/chartex" xmlns:cx5="http://schemas.microsoft.com/office/drawing/2016/5/11/chartex" xmlns:cx6="http://schemas.microsoft.com/office/drawing/2016/5/12/chartex" xmlns:cx7="http://schemas.microsoft.com/office/drawing/2016/5/13/chartex" xmlns:cx8="http://schemas.microsoft.com/office/drawing/2016/5/14/chartex" xmlns:mc="http://schemas.openxmlformats.org/markup-compatibility/2006" xmlns:aink="http://schemas.microsoft.com/office/drawing/2016/ink" xmlns:am3d="http://schemas.microsoft.com/office/drawing/2017/model3d" xmlns:o="urn:schemas-microsoft-com:office:office" xmlns:oel="http://schemas.microsoft.com/office/2019/extlst" xmlns:r="http://schemas.openxmlformats.org/officeDocument/2006/relationships" xmlns:m="http://schemas.openxmlformats.org/officeDocument/2006/math" xmlns:v="urn:schemas-microsoft-com:vml" xmlns:wp14="http://schemas.microsoft.com/office/word/2010/wordprocessingDrawing" xmlns:wp="http://schemas.openxmlformats.org/drawingml/2006/wordprocessingDrawing" xmlns:w10="urn:schemas-microsoft-com:office:word" xmlns:w="http://schemas.openxmlformats.org/wordprocessingml/2006/main" xmlns:w14="http://schemas.microsoft.com/office/word/2010/wordml" xmlns:w15="http://schemas.microsoft.com/office/word/2012/wordml" xmlns:w16cex="http://schemas.microsoft.com/office/word/2018/wordml/cex" xmlns:w16cid="http://schemas.microsoft.com/office/word/2016/wordml/cid" xmlns:w16="http://schemas.microsoft.com/office/word/2018/wordml" xmlns:w16du="http://schemas.microsoft.com/office/word/2023/wordml/word16du" xmlns:w16sdtdh="http://schemas.microsoft.com/office/word/2020/wordml/sdtdatahash" xmlns:w16sdtfl="http://schemas.microsoft.com/office/word/2024/wordml/sdtformatlock" xmlns:w16se="http://schemas.microsoft.com/office/word/2015/wordml/symex" xmlns:wpg="http://schemas.microsoft.com/office/word/2010/wordprocessingGroup" xmlns:wpi="http://schemas.microsoft.com/office/word/2010/wordprocessingInk" xmlns:wne="http://schemas.microsoft.com/office/word/2006/wordml" xmlns:wps="http://schemas.microsoft.com/office/word/2010/wordprocessingShape" mc:Ignorable="w14 w15 w16se w16cid w16 w16cex w16sdtdh w16sdtfl w16du wp14">
+<w:endnotes xmlns:wpc="http://schemas.microsoft.com/office/word/2010/wordprocessingCanvas" xmlns:cx="http://schemas.microsoft.com/office/drawing/2014/chartex" xmlns:cx1="http://schemas.microsoft.com/office/drawing/2015/9/8/chartex" xmlns:cx2="http://schemas.microsoft.com/office/drawing/2015/10/21/chartex" xmlns:cx3="http://schemas.microsoft.com/office/drawing/2016/5/9/chartex" xmlns:cx4="http://schemas.microsoft.com/office/drawing/2016/5/10/chartex" xmlns:cx5="http://schemas.microsoft.com/office/drawing/2016/5/11/chartex" xmlns:cx6="http://schemas.microsoft.com/office/drawing/2016/5/12/chartex" xmlns:cx7="http://schemas.microsoft.com/office/drawing/2016/5/13/chartex" xmlns:cx8="http://schemas.microsoft.com/office/drawing/2016/5/14/chartex" xmlns:mc="http://schemas.openxmlformats.org/markup-compatibility/2006" xmlns:aink="http://schemas.microsoft.com/office/drawing/2016/ink" xmlns:am3d="http://schemas.microsoft.com/office/drawing/2017/model3d" xmlns:o="urn:schemas-microsoft-com:office:office" xmlns:r="http://schemas.openxmlformats.org/officeDocument/2006/relationships" xmlns:m="http://schemas.openxmlformats.org/officeDocument/2006/math" xmlns:v="urn:schemas-microsoft-com:vml" xmlns:wp14="http://schemas.microsoft.com/office/word/2010/wordprocessingDrawing" xmlns:wp="http://schemas.openxmlformats.org/drawingml/2006/wordprocessingDrawing" xmlns:w10="urn:schemas-microsoft-com:office:word" xmlns:w="http://schemas.openxmlformats.org/wordprocessingml/2006/main" xmlns:w14="http://schemas.microsoft.com/office/word/2010/wordml" xmlns:w15="http://schemas.microsoft.com/office/word/2012/wordml" xmlns:w16cid="http://schemas.microsoft.com/office/word/2016/wordml/cid" xmlns:w16se="http://schemas.microsoft.com/office/word/2015/wordml/symex" xmlns:wpg="http://schemas.microsoft.com/office/word/2010/wordprocessingGroup" xmlns:wpi="http://schemas.microsoft.com/office/word/2010/wordprocessingInk" xmlns:wne="http://schemas.microsoft.com/office/word/2006/wordml" xmlns:wps="http://schemas.microsoft.com/office/word/2010/wordprocessingShape" mc:Ignorable="w14 w15 w16se w16cid wp14">
   <w:endnote w:type="separator" w:id="-1">
     <w:p>
       <w:pPr>
@@ -2275,7 +2348,7 @@
 </file>
 
 <file path=word/footer1.xml><?xml version="1.0" encoding="utf-8"?>
-<w:ftr xmlns:wpc="http://schemas.microsoft.com/office/word/2010/wordprocessingCanvas" xmlns:cx="http://schemas.microsoft.com/office/drawing/2014/chartex" xmlns:cx1="http://schemas.microsoft.com/office/drawing/2015/9/8/chartex" xmlns:cx2="http://schemas.microsoft.com/office/drawing/2015/10/21/chartex" xmlns:cx3="http://schemas.microsoft.com/office/drawing/2016/5/9/chartex" xmlns:cx4="http://schemas.microsoft.com/office/drawing/2016/5/10/chartex" xmlns:cx5="http://schemas.microsoft.com/office/drawing/2016/5/11/chartex" xmlns:cx6="http://schemas.microsoft.com/office/drawing/2016/5/12/chartex" xmlns:cx7="http://schemas.microsoft.com/office/drawing/2016/5/13/chartex" xmlns:cx8="http://schemas.microsoft.com/office/drawing/2016/5/14/chartex" xmlns:mc="http://schemas.openxmlformats.org/markup-compatibility/2006" xmlns:aink="http://schemas.microsoft.com/office/drawing/2016/ink" xmlns:am3d="http://schemas.microsoft.com/office/drawing/2017/model3d" xmlns:o="urn:schemas-microsoft-com:office:office" xmlns:oel="http://schemas.microsoft.com/office/2019/extlst" xmlns:r="http://schemas.openxmlformats.org/officeDocument/2006/relationships" xmlns:m="http://schemas.openxmlformats.org/officeDocument/2006/math" xmlns:v="urn:schemas-microsoft-com:vml" xmlns:wp14="http://schemas.microsoft.com/office/word/2010/wordprocessingDrawing" xmlns:wp="http://schemas.openxmlformats.org/drawingml/2006/wordprocessingDrawing" xmlns:w10="urn:schemas-microsoft-com:office:word" xmlns:w="http://schemas.openxmlformats.org/wordprocessingml/2006/main" xmlns:w14="http://schemas.microsoft.com/office/word/2010/wordml" xmlns:w15="http://schemas.microsoft.com/office/word/2012/wordml" xmlns:w16cex="http://schemas.microsoft.com/office/word/2018/wordml/cex" xmlns:w16cid="http://schemas.microsoft.com/office/word/2016/wordml/cid" xmlns:w16="http://schemas.microsoft.com/office/word/2018/wordml" xmlns:w16du="http://schemas.microsoft.com/office/word/2023/wordml/word16du" xmlns:w16sdtdh="http://schemas.microsoft.com/office/word/2020/wordml/sdtdatahash" xmlns:w16sdtfl="http://schemas.microsoft.com/office/word/2024/wordml/sdtformatlock" xmlns:w16se="http://schemas.microsoft.com/office/word/2015/wordml/symex" xmlns:wpg="http://schemas.microsoft.com/office/word/2010/wordprocessingGroup" xmlns:wpi="http://schemas.microsoft.com/office/word/2010/wordprocessingInk" xmlns:wne="http://schemas.microsoft.com/office/word/2006/wordml" xmlns:wps="http://schemas.microsoft.com/office/word/2010/wordprocessingShape" mc:Ignorable="w14 w15 w16se w16cid w16 w16cex w16sdtdh w16sdtfl w16du wp14">
+<w:ftr xmlns:wpc="http://schemas.microsoft.com/office/word/2010/wordprocessingCanvas" xmlns:cx="http://schemas.microsoft.com/office/drawing/2014/chartex" xmlns:cx1="http://schemas.microsoft.com/office/drawing/2015/9/8/chartex" xmlns:cx2="http://schemas.microsoft.com/office/drawing/2015/10/21/chartex" xmlns:cx3="http://schemas.microsoft.com/office/drawing/2016/5/9/chartex" xmlns:cx4="http://schemas.microsoft.com/office/drawing/2016/5/10/chartex" xmlns:cx5="http://schemas.microsoft.com/office/drawing/2016/5/11/chartex" xmlns:cx6="http://schemas.microsoft.com/office/drawing/2016/5/12/chartex" xmlns:cx7="http://schemas.microsoft.com/office/drawing/2016/5/13/chartex" xmlns:cx8="http://schemas.microsoft.com/office/drawing/2016/5/14/chartex" xmlns:mc="http://schemas.openxmlformats.org/markup-compatibility/2006" xmlns:aink="http://schemas.microsoft.com/office/drawing/2016/ink" xmlns:am3d="http://schemas.microsoft.com/office/drawing/2017/model3d" xmlns:o="urn:schemas-microsoft-com:office:office" xmlns:r="http://schemas.openxmlformats.org/officeDocument/2006/relationships" xmlns:m="http://schemas.openxmlformats.org/officeDocument/2006/math" xmlns:v="urn:schemas-microsoft-com:vml" xmlns:wp14="http://schemas.microsoft.com/office/word/2010/wordprocessingDrawing" xmlns:wp="http://schemas.openxmlformats.org/drawingml/2006/wordprocessingDrawing" xmlns:w10="urn:schemas-microsoft-com:office:word" xmlns:w="http://schemas.openxmlformats.org/wordprocessingml/2006/main" xmlns:w14="http://schemas.microsoft.com/office/word/2010/wordml" xmlns:w15="http://schemas.microsoft.com/office/word/2012/wordml" xmlns:w16cid="http://schemas.microsoft.com/office/word/2016/wordml/cid" xmlns:w16se="http://schemas.microsoft.com/office/word/2015/wordml/symex" xmlns:wpg="http://schemas.microsoft.com/office/word/2010/wordprocessingGroup" xmlns:wpi="http://schemas.microsoft.com/office/word/2010/wordprocessingInk" xmlns:wne="http://schemas.microsoft.com/office/word/2006/wordml" xmlns:wps="http://schemas.microsoft.com/office/word/2010/wordprocessingShape" mc:Ignorable="w14 w15 w16se w16cid wp14">
   <w:sdt>
     <w:sdtPr>
       <w:id w:val="480512754"/>
@@ -2284,6 +2357,7 @@
         <w:docPartUnique/>
       </w:docPartObj>
     </w:sdtPr>
+    <w:sdtEndPr/>
     <w:sdtContent>
       <w:p>
         <w:pPr>
@@ -2320,7 +2394,7 @@
 </file>
 
 <file path=word/footnotes.xml><?xml version="1.0" encoding="utf-8"?>
-<w:footnotes xmlns:wpc="http://schemas.microsoft.com/office/word/2010/wordprocessingCanvas" xmlns:cx="http://schemas.microsoft.com/office/drawing/2014/chartex" xmlns:cx1="http://schemas.microsoft.com/office/drawing/2015/9/8/chartex" xmlns:cx2="http://schemas.microsoft.com/office/drawing/2015/10/21/chartex" xmlns:cx3="http://schemas.microsoft.com/office/drawing/2016/5/9/chartex" xmlns:cx4="http://schemas.microsoft.com/office/drawing/2016/5/10/chartex" xmlns:cx5="http://schemas.microsoft.com/office/drawing/2016/5/11/chartex" xmlns:cx6="http://schemas.microsoft.com/office/drawing/2016/5/12/chartex" xmlns:cx7="http://schemas.microsoft.com/office/drawing/2016/5/13/chartex" xmlns:cx8="http://schemas.microsoft.com/office/drawing/2016/5/14/chartex" xmlns:mc="http://schemas.openxmlformats.org/markup-compatibility/2006" xmlns:aink="http://schemas.microsoft.com/office/drawing/2016/ink" xmlns:am3d="http://schemas.microsoft.com/office/drawing/2017/model3d" xmlns:o="urn:schemas-microsoft-com:office:office" xmlns:oel="http://schemas.microsoft.com/office/2019/extlst" xmlns:r="http://schemas.openxmlformats.org/officeDocument/2006/relationships" xmlns:m="http://schemas.openxmlformats.org/officeDocument/2006/math" xmlns:v="urn:schemas-microsoft-com:vml" xmlns:wp14="http://schemas.microsoft.com/office/word/2010/wordprocessingDrawing" xmlns:wp="http://schemas.openxmlformats.org/drawingml/2006/wordprocessingDrawing" xmlns:w10="urn:schemas-microsoft-com:office:word" xmlns:w="http://schemas.openxmlformats.org/wordprocessingml/2006/main" xmlns:w14="http://schemas.microsoft.com/office/word/2010/wordml" xmlns:w15="http://schemas.microsoft.com/office/word/2012/wordml" xmlns:w16cex="http://schemas.microsoft.com/office/word/2018/wordml/cex" xmlns:w16cid="http://schemas.microsoft.com/office/word/2016/wordml/cid" xmlns:w16="http://schemas.microsoft.com/office/word/2018/wordml" xmlns:w16du="http://schemas.microsoft.com/office/word/2023/wordml/word16du" xmlns:w16sdtdh="http://schemas.microsoft.com/office/word/2020/wordml/sdtdatahash" xmlns:w16sdtfl="http://schemas.microsoft.com/office/word/2024/wordml/sdtformatlock" xmlns:w16se="http://schemas.microsoft.com/office/word/2015/wordml/symex" xmlns:wpg="http://schemas.microsoft.com/office/word/2010/wordprocessingGroup" xmlns:wpi="http://schemas.microsoft.com/office/word/2010/wordprocessingInk" xmlns:wne="http://schemas.microsoft.com/office/word/2006/wordml" xmlns:wps="http://schemas.microsoft.com/office/word/2010/wordprocessingShape" mc:Ignorable="w14 w15 w16se w16cid w16 w16cex w16sdtdh w16sdtfl w16du wp14">
+<w:footnotes xmlns:wpc="http://schemas.microsoft.com/office/word/2010/wordprocessingCanvas" xmlns:cx="http://schemas.microsoft.com/office/drawing/2014/chartex" xmlns:cx1="http://schemas.microsoft.com/office/drawing/2015/9/8/chartex" xmlns:cx2="http://schemas.microsoft.com/office/drawing/2015/10/21/chartex" xmlns:cx3="http://schemas.microsoft.com/office/drawing/2016/5/9/chartex" xmlns:cx4="http://schemas.microsoft.com/office/drawing/2016/5/10/chartex" xmlns:cx5="http://schemas.microsoft.com/office/drawing/2016/5/11/chartex" xmlns:cx6="http://schemas.microsoft.com/office/drawing/2016/5/12/chartex" xmlns:cx7="http://schemas.microsoft.com/office/drawing/2016/5/13/chartex" xmlns:cx8="http://schemas.microsoft.com/office/drawing/2016/5/14/chartex" xmlns:mc="http://schemas.openxmlformats.org/markup-compatibility/2006" xmlns:aink="http://schemas.microsoft.com/office/drawing/2016/ink" xmlns:am3d="http://schemas.microsoft.com/office/drawing/2017/model3d" xmlns:o="urn:schemas-microsoft-com:office:office" xmlns:r="http://schemas.openxmlformats.org/officeDocument/2006/relationships" xmlns:m="http://schemas.openxmlformats.org/officeDocument/2006/math" xmlns:v="urn:schemas-microsoft-com:vml" xmlns:wp14="http://schemas.microsoft.com/office/word/2010/wordprocessingDrawing" xmlns:wp="http://schemas.openxmlformats.org/drawingml/2006/wordprocessingDrawing" xmlns:w10="urn:schemas-microsoft-com:office:word" xmlns:w="http://schemas.openxmlformats.org/wordprocessingml/2006/main" xmlns:w14="http://schemas.microsoft.com/office/word/2010/wordml" xmlns:w15="http://schemas.microsoft.com/office/word/2012/wordml" xmlns:w16cid="http://schemas.microsoft.com/office/word/2016/wordml/cid" xmlns:w16se="http://schemas.microsoft.com/office/word/2015/wordml/symex" xmlns:wpg="http://schemas.microsoft.com/office/word/2010/wordprocessingGroup" xmlns:wpi="http://schemas.microsoft.com/office/word/2010/wordprocessingInk" xmlns:wne="http://schemas.microsoft.com/office/word/2006/wordml" xmlns:wps="http://schemas.microsoft.com/office/word/2010/wordprocessingShape" mc:Ignorable="w14 w15 w16se w16cid wp14">
   <w:footnote w:type="separator" w:id="-1">
     <w:p>
       <w:pPr>
@@ -2345,7 +2419,7 @@
 </file>
 
 <file path=word/numbering.xml><?xml version="1.0" encoding="utf-8"?>
-<w:numbering xmlns:wpc="http://schemas.microsoft.com/office/word/2010/wordprocessingCanvas" xmlns:cx="http://schemas.microsoft.com/office/drawing/2014/chartex" xmlns:cx1="http://schemas.microsoft.com/office/drawing/2015/9/8/chartex" xmlns:cx2="http://schemas.microsoft.com/office/drawing/2015/10/21/chartex" xmlns:cx3="http://schemas.microsoft.com/office/drawing/2016/5/9/chartex" xmlns:cx4="http://schemas.microsoft.com/office/drawing/2016/5/10/chartex" xmlns:cx5="http://schemas.microsoft.com/office/drawing/2016/5/11/chartex" xmlns:cx6="http://schemas.microsoft.com/office/drawing/2016/5/12/chartex" xmlns:cx7="http://schemas.microsoft.com/office/drawing/2016/5/13/chartex" xmlns:cx8="http://schemas.microsoft.com/office/drawing/2016/5/14/chartex" xmlns:mc="http://schemas.openxmlformats.org/markup-compatibility/2006" xmlns:aink="http://schemas.microsoft.com/office/drawing/2016/ink" xmlns:am3d="http://schemas.microsoft.com/office/drawing/2017/model3d" xmlns:o="urn:schemas-microsoft-com:office:office" xmlns:oel="http://schemas.microsoft.com/office/2019/extlst" xmlns:r="http://schemas.openxmlformats.org/officeDocument/2006/relationships" xmlns:m="http://schemas.openxmlformats.org/officeDocument/2006/math" xmlns:v="urn:schemas-microsoft-com:vml" xmlns:wp14="http://schemas.microsoft.com/office/word/2010/wordprocessingDrawing" xmlns:wp="http://schemas.openxmlformats.org/drawingml/2006/wordprocessingDrawing" xmlns:w10="urn:schemas-microsoft-com:office:word" xmlns:w="http://schemas.openxmlformats.org/wordprocessingml/2006/main" xmlns:w14="http://schemas.microsoft.com/office/word/2010/wordml" xmlns:w15="http://schemas.microsoft.com/office/word/2012/wordml" xmlns:w16cex="http://schemas.microsoft.com/office/word/2018/wordml/cex" xmlns:w16cid="http://schemas.microsoft.com/office/word/2016/wordml/cid" xmlns:w16="http://schemas.microsoft.com/office/word/2018/wordml" xmlns:w16du="http://schemas.microsoft.com/office/word/2023/wordml/word16du" xmlns:w16sdtdh="http://schemas.microsoft.com/office/word/2020/wordml/sdtdatahash" xmlns:w16sdtfl="http://schemas.microsoft.com/office/word/2024/wordml/sdtformatlock" xmlns:w16se="http://schemas.microsoft.com/office/word/2015/wordml/symex" xmlns:wpg="http://schemas.microsoft.com/office/word/2010/wordprocessingGroup" xmlns:wpi="http://schemas.microsoft.com/office/word/2010/wordprocessingInk" xmlns:wne="http://schemas.microsoft.com/office/word/2006/wordml" xmlns:wps="http://schemas.microsoft.com/office/word/2010/wordprocessingShape" mc:Ignorable="w14 w15 w16se w16cid w16 w16cex w16sdtdh w16sdtfl w16du wp14">
+<w:numbering xmlns:wpc="http://schemas.microsoft.com/office/word/2010/wordprocessingCanvas" xmlns:cx="http://schemas.microsoft.com/office/drawing/2014/chartex" xmlns:cx1="http://schemas.microsoft.com/office/drawing/2015/9/8/chartex" xmlns:cx2="http://schemas.microsoft.com/office/drawing/2015/10/21/chartex" xmlns:cx3="http://schemas.microsoft.com/office/drawing/2016/5/9/chartex" xmlns:cx4="http://schemas.microsoft.com/office/drawing/2016/5/10/chartex" xmlns:cx5="http://schemas.microsoft.com/office/drawing/2016/5/11/chartex" xmlns:cx6="http://schemas.microsoft.com/office/drawing/2016/5/12/chartex" xmlns:cx7="http://schemas.microsoft.com/office/drawing/2016/5/13/chartex" xmlns:cx8="http://schemas.microsoft.com/office/drawing/2016/5/14/chartex" xmlns:mc="http://schemas.openxmlformats.org/markup-compatibility/2006" xmlns:aink="http://schemas.microsoft.com/office/drawing/2016/ink" xmlns:am3d="http://schemas.microsoft.com/office/drawing/2017/model3d" xmlns:o="urn:schemas-microsoft-com:office:office" xmlns:r="http://schemas.openxmlformats.org/officeDocument/2006/relationships" xmlns:m="http://schemas.openxmlformats.org/officeDocument/2006/math" xmlns:v="urn:schemas-microsoft-com:vml" xmlns:wp14="http://schemas.microsoft.com/office/word/2010/wordprocessingDrawing" xmlns:wp="http://schemas.openxmlformats.org/drawingml/2006/wordprocessingDrawing" xmlns:w10="urn:schemas-microsoft-com:office:word" xmlns:w="http://schemas.openxmlformats.org/wordprocessingml/2006/main" xmlns:w14="http://schemas.microsoft.com/office/word/2010/wordml" xmlns:w15="http://schemas.microsoft.com/office/word/2012/wordml" xmlns:w16cid="http://schemas.microsoft.com/office/word/2016/wordml/cid" xmlns:w16se="http://schemas.microsoft.com/office/word/2015/wordml/symex" xmlns:wpg="http://schemas.microsoft.com/office/word/2010/wordprocessingGroup" xmlns:wpi="http://schemas.microsoft.com/office/word/2010/wordprocessingInk" xmlns:wne="http://schemas.microsoft.com/office/word/2006/wordml" xmlns:wps="http://schemas.microsoft.com/office/word/2010/wordprocessingShape" mc:Ignorable="w14 w15 w16se w16cid wp14">
   <w:abstractNum w:abstractNumId="0" w15:restartNumberingAfterBreak="0">
     <w:nsid w:val="031B44DA"/>
     <w:multiLevelType w:val="hybridMultilevel"/>
@@ -3411,44 +3485,44 @@
       </w:pPr>
     </w:lvl>
   </w:abstractNum>
-  <w:num w:numId="1" w16cid:durableId="935017595">
+  <w:num w:numId="1">
     <w:abstractNumId w:val="6"/>
   </w:num>
-  <w:num w:numId="2" w16cid:durableId="810096265">
+  <w:num w:numId="2">
     <w:abstractNumId w:val="2"/>
   </w:num>
-  <w:num w:numId="3" w16cid:durableId="1899826232">
+  <w:num w:numId="3">
     <w:abstractNumId w:val="3"/>
   </w:num>
-  <w:num w:numId="4" w16cid:durableId="887374240">
+  <w:num w:numId="4">
     <w:abstractNumId w:val="0"/>
   </w:num>
-  <w:num w:numId="5" w16cid:durableId="542256013">
+  <w:num w:numId="5">
     <w:abstractNumId w:val="1"/>
   </w:num>
-  <w:num w:numId="6" w16cid:durableId="331303253">
+  <w:num w:numId="6">
     <w:abstractNumId w:val="9"/>
   </w:num>
-  <w:num w:numId="7" w16cid:durableId="107049443">
+  <w:num w:numId="7">
     <w:abstractNumId w:val="7"/>
   </w:num>
-  <w:num w:numId="8" w16cid:durableId="1852524800">
+  <w:num w:numId="8">
     <w:abstractNumId w:val="10"/>
   </w:num>
-  <w:num w:numId="9" w16cid:durableId="1143694880">
+  <w:num w:numId="9">
     <w:abstractNumId w:val="5"/>
   </w:num>
-  <w:num w:numId="10" w16cid:durableId="2142919944">
+  <w:num w:numId="10">
     <w:abstractNumId w:val="4"/>
   </w:num>
-  <w:num w:numId="11" w16cid:durableId="1888567092">
+  <w:num w:numId="11">
     <w:abstractNumId w:val="8"/>
   </w:num>
 </w:numbering>
 </file>
 
 <file path=word/styles.xml><?xml version="1.0" encoding="utf-8"?>
-<w:styles xmlns:mc="http://schemas.openxmlformats.org/markup-compatibility/2006" xmlns:r="http://schemas.openxmlformats.org/officeDocument/2006/relationships" xmlns:w="http://schemas.openxmlformats.org/wordprocessingml/2006/main" xmlns:w14="http://schemas.microsoft.com/office/word/2010/wordml" xmlns:w15="http://schemas.microsoft.com/office/word/2012/wordml" xmlns:w16cex="http://schemas.microsoft.com/office/word/2018/wordml/cex" xmlns:w16cid="http://schemas.microsoft.com/office/word/2016/wordml/cid" xmlns:w16="http://schemas.microsoft.com/office/word/2018/wordml" xmlns:w16du="http://schemas.microsoft.com/office/word/2023/wordml/word16du" xmlns:w16sdtdh="http://schemas.microsoft.com/office/word/2020/wordml/sdtdatahash" xmlns:w16sdtfl="http://schemas.microsoft.com/office/word/2024/wordml/sdtformatlock" xmlns:w16se="http://schemas.microsoft.com/office/word/2015/wordml/symex" mc:Ignorable="w14 w15 w16se w16cid w16 w16cex w16sdtdh w16sdtfl w16du">
+<w:styles xmlns:mc="http://schemas.openxmlformats.org/markup-compatibility/2006" xmlns:r="http://schemas.openxmlformats.org/officeDocument/2006/relationships" xmlns:w="http://schemas.openxmlformats.org/wordprocessingml/2006/main" xmlns:w14="http://schemas.microsoft.com/office/word/2010/wordml" xmlns:w15="http://schemas.microsoft.com/office/word/2012/wordml" xmlns:w16cid="http://schemas.microsoft.com/office/word/2016/wordml/cid" xmlns:w16se="http://schemas.microsoft.com/office/word/2015/wordml/symex" mc:Ignorable="w14 w15 w16se w16cid">
   <w:docDefaults>
     <w:rPrDefault>
       <w:rPr>
@@ -3464,7 +3538,7 @@
       </w:pPr>
     </w:pPrDefault>
   </w:docDefaults>
-  <w:latentStyles w:defLockedState="0" w:defUIPriority="99" w:defSemiHidden="0" w:defUnhideWhenUsed="0" w:defQFormat="0" w:count="376">
+  <w:latentStyles w:defLockedState="0" w:defUIPriority="99" w:defSemiHidden="0" w:defUnhideWhenUsed="0" w:defQFormat="0" w:count="375">
     <w:lsdException w:name="Normal" w:uiPriority="0" w:qFormat="1"/>
     <w:lsdException w:name="heading 1" w:uiPriority="9" w:qFormat="1"/>
     <w:lsdException w:name="heading 2" w:semiHidden="1" w:uiPriority="9" w:unhideWhenUsed="1" w:qFormat="1"/>
@@ -3840,7 +3914,6 @@
     <w:lsdException w:name="Smart Hyperlink" w:semiHidden="1" w:unhideWhenUsed="1"/>
     <w:lsdException w:name="Hashtag" w:semiHidden="1" w:unhideWhenUsed="1"/>
     <w:lsdException w:name="Unresolved Mention" w:semiHidden="1" w:unhideWhenUsed="1"/>
-    <w:lsdException w:name="Smart Link" w:semiHidden="1" w:unhideWhenUsed="1"/>
   </w:latentStyles>
   <w:style w:type="paragraph" w:default="1" w:styleId="Standard">
     <w:name w:val="Normal"/>
@@ -4770,7 +4843,7 @@
 </file>
 
 <file path=word/glossary/document.xml><?xml version="1.0" encoding="utf-8"?>
-<w:glossaryDocument xmlns:wpc="http://schemas.microsoft.com/office/word/2010/wordprocessingCanvas" xmlns:cx="http://schemas.microsoft.com/office/drawing/2014/chartex" xmlns:cx1="http://schemas.microsoft.com/office/drawing/2015/9/8/chartex" xmlns:cx2="http://schemas.microsoft.com/office/drawing/2015/10/21/chartex" xmlns:cx3="http://schemas.microsoft.com/office/drawing/2016/5/9/chartex" xmlns:cx4="http://schemas.microsoft.com/office/drawing/2016/5/10/chartex" xmlns:cx5="http://schemas.microsoft.com/office/drawing/2016/5/11/chartex" xmlns:cx6="http://schemas.microsoft.com/office/drawing/2016/5/12/chartex" xmlns:cx7="http://schemas.microsoft.com/office/drawing/2016/5/13/chartex" xmlns:cx8="http://schemas.microsoft.com/office/drawing/2016/5/14/chartex" xmlns:mc="http://schemas.openxmlformats.org/markup-compatibility/2006" xmlns:aink="http://schemas.microsoft.com/office/drawing/2016/ink" xmlns:am3d="http://schemas.microsoft.com/office/drawing/2017/model3d" xmlns:o="urn:schemas-microsoft-com:office:office" xmlns:oel="http://schemas.microsoft.com/office/2019/extlst" xmlns:r="http://schemas.openxmlformats.org/officeDocument/2006/relationships" xmlns:m="http://schemas.openxmlformats.org/officeDocument/2006/math" xmlns:v="urn:schemas-microsoft-com:vml" xmlns:wp14="http://schemas.microsoft.com/office/word/2010/wordprocessingDrawing" xmlns:wp="http://schemas.openxmlformats.org/drawingml/2006/wordprocessingDrawing" xmlns:w10="urn:schemas-microsoft-com:office:word" xmlns:w="http://schemas.openxmlformats.org/wordprocessingml/2006/main" xmlns:w14="http://schemas.microsoft.com/office/word/2010/wordml" xmlns:w15="http://schemas.microsoft.com/office/word/2012/wordml" xmlns:w16cex="http://schemas.microsoft.com/office/word/2018/wordml/cex" xmlns:w16cid="http://schemas.microsoft.com/office/word/2016/wordml/cid" xmlns:w16="http://schemas.microsoft.com/office/word/2018/wordml" xmlns:w16du="http://schemas.microsoft.com/office/word/2023/wordml/word16du" xmlns:w16sdtdh="http://schemas.microsoft.com/office/word/2020/wordml/sdtdatahash" xmlns:w16sdtfl="http://schemas.microsoft.com/office/word/2024/wordml/sdtformatlock" xmlns:w16se="http://schemas.microsoft.com/office/word/2015/wordml/symex" xmlns:wpg="http://schemas.microsoft.com/office/word/2010/wordprocessingGroup" xmlns:wpi="http://schemas.microsoft.com/office/word/2010/wordprocessingInk" xmlns:wne="http://schemas.microsoft.com/office/word/2006/wordml" xmlns:wps="http://schemas.microsoft.com/office/word/2010/wordprocessingShape" mc:Ignorable="w14 w15 w16se w16cid w16 w16cex w16sdtdh w16sdtfl w16du wp14">
+<w:glossaryDocument xmlns:wpc="http://schemas.microsoft.com/office/word/2010/wordprocessingCanvas" xmlns:cx="http://schemas.microsoft.com/office/drawing/2014/chartex" xmlns:cx1="http://schemas.microsoft.com/office/drawing/2015/9/8/chartex" xmlns:cx2="http://schemas.microsoft.com/office/drawing/2015/10/21/chartex" xmlns:cx3="http://schemas.microsoft.com/office/drawing/2016/5/9/chartex" xmlns:cx4="http://schemas.microsoft.com/office/drawing/2016/5/10/chartex" xmlns:cx5="http://schemas.microsoft.com/office/drawing/2016/5/11/chartex" xmlns:cx6="http://schemas.microsoft.com/office/drawing/2016/5/12/chartex" xmlns:cx7="http://schemas.microsoft.com/office/drawing/2016/5/13/chartex" xmlns:cx8="http://schemas.microsoft.com/office/drawing/2016/5/14/chartex" xmlns:mc="http://schemas.openxmlformats.org/markup-compatibility/2006" xmlns:aink="http://schemas.microsoft.com/office/drawing/2016/ink" xmlns:am3d="http://schemas.microsoft.com/office/drawing/2017/model3d" xmlns:o="urn:schemas-microsoft-com:office:office" xmlns:r="http://schemas.openxmlformats.org/officeDocument/2006/relationships" xmlns:m="http://schemas.openxmlformats.org/officeDocument/2006/math" xmlns:v="urn:schemas-microsoft-com:vml" xmlns:wp14="http://schemas.microsoft.com/office/word/2010/wordprocessingDrawing" xmlns:wp="http://schemas.openxmlformats.org/drawingml/2006/wordprocessingDrawing" xmlns:w10="urn:schemas-microsoft-com:office:word" xmlns:w="http://schemas.openxmlformats.org/wordprocessingml/2006/main" xmlns:w14="http://schemas.microsoft.com/office/word/2010/wordml" xmlns:w15="http://schemas.microsoft.com/office/word/2012/wordml" xmlns:w16cid="http://schemas.microsoft.com/office/word/2016/wordml/cid" xmlns:w16se="http://schemas.microsoft.com/office/word/2015/wordml/symex" xmlns:wpg="http://schemas.microsoft.com/office/word/2010/wordprocessingGroup" xmlns:wpi="http://schemas.microsoft.com/office/word/2010/wordprocessingInk" xmlns:wne="http://schemas.microsoft.com/office/word/2006/wordml" xmlns:wps="http://schemas.microsoft.com/office/word/2010/wordprocessingShape" mc:Ignorable="w14 w15 w16se w16cid wp14">
   <w:docParts>
     <w:docPart>
       <w:docPartPr>
@@ -4803,7 +4876,7 @@
 </file>
 
 <file path=word/glossary/fontTable.xml><?xml version="1.0" encoding="utf-8"?>
-<w:fonts xmlns:mc="http://schemas.openxmlformats.org/markup-compatibility/2006" xmlns:r="http://schemas.openxmlformats.org/officeDocument/2006/relationships" xmlns:w="http://schemas.openxmlformats.org/wordprocessingml/2006/main" xmlns:w14="http://schemas.microsoft.com/office/word/2010/wordml" xmlns:w15="http://schemas.microsoft.com/office/word/2012/wordml" xmlns:w16cex="http://schemas.microsoft.com/office/word/2018/wordml/cex" xmlns:w16cid="http://schemas.microsoft.com/office/word/2016/wordml/cid" xmlns:w16="http://schemas.microsoft.com/office/word/2018/wordml" xmlns:w16du="http://schemas.microsoft.com/office/word/2023/wordml/word16du" xmlns:w16sdtdh="http://schemas.microsoft.com/office/word/2020/wordml/sdtdatahash" xmlns:w16sdtfl="http://schemas.microsoft.com/office/word/2024/wordml/sdtformatlock" xmlns:w16se="http://schemas.microsoft.com/office/word/2015/wordml/symex" mc:Ignorable="w14 w15 w16se w16cid w16 w16cex w16sdtdh w16sdtfl w16du">
+<w:fonts xmlns:mc="http://schemas.openxmlformats.org/markup-compatibility/2006" xmlns:r="http://schemas.openxmlformats.org/officeDocument/2006/relationships" xmlns:w="http://schemas.openxmlformats.org/wordprocessingml/2006/main" xmlns:w14="http://schemas.microsoft.com/office/word/2010/wordml" xmlns:w15="http://schemas.microsoft.com/office/word/2012/wordml" xmlns:w16cid="http://schemas.microsoft.com/office/word/2016/wordml/cid" xmlns:w16se="http://schemas.microsoft.com/office/word/2015/wordml/symex" mc:Ignorable="w14 w15 w16se w16cid">
   <w:font w:name="Symbol">
     <w:panose1 w:val="05050102010706020507"/>
     <w:charset w:val="02"/>
@@ -4853,23 +4926,11 @@
     <w:pitch w:val="variable"/>
     <w:sig w:usb0="E4002EFF" w:usb1="C000E47F" w:usb2="00000009" w:usb3="00000000" w:csb0="000001FF" w:csb1="00000000"/>
   </w:font>
-  <w:font w:name="Aptos">
-    <w:charset w:val="00"/>
-    <w:family w:val="swiss"/>
-    <w:pitch w:val="variable"/>
-    <w:sig w:usb0="20000287" w:usb1="00000003" w:usb2="00000000" w:usb3="00000000" w:csb0="0000019F" w:csb1="00000000"/>
-  </w:font>
-  <w:font w:name="Aptos Display">
-    <w:charset w:val="00"/>
-    <w:family w:val="swiss"/>
-    <w:pitch w:val="variable"/>
-    <w:sig w:usb0="20000287" w:usb1="00000003" w:usb2="00000000" w:usb3="00000000" w:csb0="0000019F" w:csb1="00000000"/>
-  </w:font>
 </w:fonts>
 </file>
 
 <file path=word/glossary/settings.xml><?xml version="1.0" encoding="utf-8"?>
-<w:settings xmlns:mc="http://schemas.openxmlformats.org/markup-compatibility/2006" xmlns:o="urn:schemas-microsoft-com:office:office" xmlns:r="http://schemas.openxmlformats.org/officeDocument/2006/relationships" xmlns:m="http://schemas.openxmlformats.org/officeDocument/2006/math" xmlns:v="urn:schemas-microsoft-com:vml" xmlns:w10="urn:schemas-microsoft-com:office:word" xmlns:w="http://schemas.openxmlformats.org/wordprocessingml/2006/main" xmlns:w14="http://schemas.microsoft.com/office/word/2010/wordml" xmlns:w15="http://schemas.microsoft.com/office/word/2012/wordml" xmlns:w16cex="http://schemas.microsoft.com/office/word/2018/wordml/cex" xmlns:w16cid="http://schemas.microsoft.com/office/word/2016/wordml/cid" xmlns:w16="http://schemas.microsoft.com/office/word/2018/wordml" xmlns:w16du="http://schemas.microsoft.com/office/word/2023/wordml/word16du" xmlns:w16sdtdh="http://schemas.microsoft.com/office/word/2020/wordml/sdtdatahash" xmlns:w16sdtfl="http://schemas.microsoft.com/office/word/2024/wordml/sdtformatlock" xmlns:w16se="http://schemas.microsoft.com/office/word/2015/wordml/symex" xmlns:sl="http://schemas.openxmlformats.org/schemaLibrary/2006/main" mc:Ignorable="w14 w15 w16se w16cid w16 w16cex w16sdtdh w16sdtfl w16du">
+<w:settings xmlns:mc="http://schemas.openxmlformats.org/markup-compatibility/2006" xmlns:o="urn:schemas-microsoft-com:office:office" xmlns:r="http://schemas.openxmlformats.org/officeDocument/2006/relationships" xmlns:m="http://schemas.openxmlformats.org/officeDocument/2006/math" xmlns:v="urn:schemas-microsoft-com:vml" xmlns:w10="urn:schemas-microsoft-com:office:word" xmlns:w="http://schemas.openxmlformats.org/wordprocessingml/2006/main" xmlns:w14="http://schemas.microsoft.com/office/word/2010/wordml" xmlns:w15="http://schemas.microsoft.com/office/word/2012/wordml" xmlns:w16cid="http://schemas.microsoft.com/office/word/2016/wordml/cid" xmlns:w16se="http://schemas.microsoft.com/office/word/2015/wordml/symex" xmlns:sl="http://schemas.openxmlformats.org/schemaLibrary/2006/main" mc:Ignorable="w14 w15 w16se w16cid">
   <w:view w:val="normal"/>
   <w:revisionView w:inkAnnotations="0"/>
   <w:defaultTabStop w:val="708"/>
@@ -4958,7 +5019,7 @@
 </file>
 
 <file path=word/glossary/styles.xml><?xml version="1.0" encoding="utf-8"?>
-<w:styles xmlns:mc="http://schemas.openxmlformats.org/markup-compatibility/2006" xmlns:r="http://schemas.openxmlformats.org/officeDocument/2006/relationships" xmlns:w="http://schemas.openxmlformats.org/wordprocessingml/2006/main" xmlns:w14="http://schemas.microsoft.com/office/word/2010/wordml" xmlns:w15="http://schemas.microsoft.com/office/word/2012/wordml" xmlns:w16cex="http://schemas.microsoft.com/office/word/2018/wordml/cex" xmlns:w16cid="http://schemas.microsoft.com/office/word/2016/wordml/cid" xmlns:w16="http://schemas.microsoft.com/office/word/2018/wordml" xmlns:w16du="http://schemas.microsoft.com/office/word/2023/wordml/word16du" xmlns:w16sdtdh="http://schemas.microsoft.com/office/word/2020/wordml/sdtdatahash" xmlns:w16sdtfl="http://schemas.microsoft.com/office/word/2024/wordml/sdtformatlock" xmlns:w16se="http://schemas.microsoft.com/office/word/2015/wordml/symex" mc:Ignorable="w14 w15 w16se w16cid w16 w16cex w16sdtdh w16sdtfl w16du">
+<w:styles xmlns:mc="http://schemas.openxmlformats.org/markup-compatibility/2006" xmlns:r="http://schemas.openxmlformats.org/officeDocument/2006/relationships" xmlns:w="http://schemas.openxmlformats.org/wordprocessingml/2006/main" xmlns:w14="http://schemas.microsoft.com/office/word/2010/wordml" xmlns:w15="http://schemas.microsoft.com/office/word/2012/wordml" xmlns:w16cid="http://schemas.microsoft.com/office/word/2016/wordml/cid" xmlns:w16se="http://schemas.microsoft.com/office/word/2015/wordml/symex" mc:Ignorable="w14 w15 w16se w16cid">
   <w:docDefaults>
     <w:rPrDefault>
       <w:rPr>
@@ -4974,7 +5035,7 @@
       </w:pPr>
     </w:pPrDefault>
   </w:docDefaults>
-  <w:latentStyles w:defLockedState="0" w:defUIPriority="99" w:defSemiHidden="0" w:defUnhideWhenUsed="0" w:defQFormat="0" w:count="376">
+  <w:latentStyles w:defLockedState="0" w:defUIPriority="99" w:defSemiHidden="0" w:defUnhideWhenUsed="0" w:defQFormat="0" w:count="375">
     <w:lsdException w:name="Normal" w:uiPriority="0" w:qFormat="1"/>
     <w:lsdException w:name="heading 1" w:uiPriority="9" w:qFormat="1"/>
     <w:lsdException w:name="heading 2" w:semiHidden="1" w:uiPriority="9" w:unhideWhenUsed="1" w:qFormat="1"/>
@@ -5350,7 +5411,6 @@
     <w:lsdException w:name="Smart Hyperlink" w:semiHidden="1" w:unhideWhenUsed="1"/>
     <w:lsdException w:name="Hashtag" w:semiHidden="1" w:unhideWhenUsed="1"/>
     <w:lsdException w:name="Unresolved Mention" w:semiHidden="1" w:unhideWhenUsed="1"/>
-    <w:lsdException w:name="Smart Link" w:semiHidden="1" w:unhideWhenUsed="1"/>
   </w:latentStyles>
   <w:style w:type="paragraph" w:default="1" w:styleId="Standard">
     <w:name w:val="Normal"/>
@@ -5397,7 +5457,7 @@
 </file>
 
 <file path=word/glossary/webSettings.xml><?xml version="1.0" encoding="utf-8"?>
-<w:webSettings xmlns:mc="http://schemas.openxmlformats.org/markup-compatibility/2006" xmlns:r="http://schemas.openxmlformats.org/officeDocument/2006/relationships" xmlns:w="http://schemas.openxmlformats.org/wordprocessingml/2006/main" xmlns:w14="http://schemas.microsoft.com/office/word/2010/wordml" xmlns:w15="http://schemas.microsoft.com/office/word/2012/wordml" xmlns:w16cex="http://schemas.microsoft.com/office/word/2018/wordml/cex" xmlns:w16cid="http://schemas.microsoft.com/office/word/2016/wordml/cid" xmlns:w16="http://schemas.microsoft.com/office/word/2018/wordml" xmlns:w16du="http://schemas.microsoft.com/office/word/2023/wordml/word16du" xmlns:w16sdtdh="http://schemas.microsoft.com/office/word/2020/wordml/sdtdatahash" xmlns:w16sdtfl="http://schemas.microsoft.com/office/word/2024/wordml/sdtformatlock" xmlns:w16se="http://schemas.microsoft.com/office/word/2015/wordml/symex" mc:Ignorable="w14 w15 w16se w16cid w16 w16cex w16sdtdh w16sdtfl w16du">
+<w:webSettings xmlns:mc="http://schemas.openxmlformats.org/markup-compatibility/2006" xmlns:r="http://schemas.openxmlformats.org/officeDocument/2006/relationships" xmlns:w="http://schemas.openxmlformats.org/wordprocessingml/2006/main" xmlns:w14="http://schemas.microsoft.com/office/word/2010/wordml" xmlns:w15="http://schemas.microsoft.com/office/word/2012/wordml" xmlns:w16cid="http://schemas.microsoft.com/office/word/2016/wordml/cid" xmlns:w16se="http://schemas.microsoft.com/office/word/2015/wordml/symex" mc:Ignorable="w14 w15 w16se w16cid">
   <w:optimizeForBrowser/>
   <w:allowPNG/>
 </w:webSettings>
@@ -5669,7 +5729,7 @@
 </file>
 
 <file path=customXml/itemProps1.xml><?xml version="1.0" encoding="utf-8"?>
-<ds:datastoreItem xmlns:ds="http://schemas.openxmlformats.org/officeDocument/2006/customXml" ds:itemID="{D60C6175-FCF2-4DD7-8F58-85BEE0A5F7FE}">
+<ds:datastoreItem xmlns:ds="http://schemas.openxmlformats.org/officeDocument/2006/customXml" ds:itemID="{0624FF36-8D1D-4BA2-94D9-DA44AE2D8692}">
   <ds:schemaRefs>
     <ds:schemaRef ds:uri="http://schemas.openxmlformats.org/officeDocument/2006/bibliography"/>
   </ds:schemaRefs>

</xml_diff>